<commit_message>
Agrega logo Tec de Juárez a la portada del documento de normas
Co-Authored-By: Claude <noreply@anthropic.com>
Claude-Session: https://claude.ai/code/session_01FQByZcxKiiViTFYyhYPaTh
</commit_message>
<xml_diff>
--- a/CAD2026/Normas_dibujo_tecnico_NOM_ISO_ANSI.docx
+++ b/CAD2026/Normas_dibujo_tecnico_NOM_ISO_ANSI.docx
@@ -7,55 +7,52 @@
         <w:spacing w:before="200"/>
       </w:pPr>
     </w:p>
-    <w:tbl>
-      <w:tblPr>
-        <w:tblW w:type="dxa" w:w="4320"/>
+    <w:p>
+      <w:pPr>
+        <w:spacing w:after="200"/>
         <w:jc w:val="center"/>
-        <w:tblBorders>
-          <w:top w:val="single" w:color="auto" w:sz="4"/>
-          <w:left w:val="single" w:color="auto" w:sz="4"/>
-          <w:bottom w:val="single" w:color="auto" w:sz="4"/>
-          <w:right w:val="single" w:color="auto" w:sz="4"/>
-          <w:insideH w:val="single" w:color="auto" w:sz="4"/>
-          <w:insideV w:val="single" w:color="auto" w:sz="4"/>
-        </w:tblBorders>
-      </w:tblPr>
-      <w:tblGrid>
-        <w:gridCol w:w="4320"/>
-      </w:tblGrid>
-      <w:tr>
-        <w:trPr>
-          <w:trHeight w:val="1600"/>
-        </w:trPr>
-        <w:tc>
-          <w:tcPr>
-            <w:tcW w:type="dxa" w:w="4320"/>
-            <w:tcBorders>
-              <w:top w:val="dashed" w:color="5B6575" w:sz="6"/>
-              <w:left w:val="dashed" w:color="5B6575" w:sz="6"/>
-              <w:bottom w:val="dashed" w:color="5B6575" w:sz="6"/>
-              <w:right w:val="dashed" w:color="5B6575" w:sz="6"/>
-            </w:tcBorders>
-            <w:vAlign w:val="center"/>
-          </w:tcPr>
-          <w:p>
-            <w:pPr>
-              <w:jc w:val="center"/>
-            </w:pPr>
-            <w:r>
-              <w:rPr>
-                <w:i/>
-                <w:iCs/>
-                <w:color w:val="5B6575"/>
-                <w:sz w:val="18"/>
-                <w:szCs w:val="18"/>
-              </w:rPr>
-              <w:t xml:space="preserve">Espacio para el logo del ITCJ</w:t>
-            </w:r>
-          </w:p>
-        </w:tc>
-      </w:tr>
-    </w:tbl>
+      </w:pPr>
+      <w:r>
+        <w:drawing>
+          <wp:inline distT="0" distB="0" distL="0" distR="0">
+            <wp:extent cx="3019425" cy="1428750"/>
+            <wp:effectExtent t="0" r="0" b="0" l="0"/>
+            <wp:docPr id="1" name="" descr="" title=""/>
+            <wp:cNvGraphicFramePr>
+              <a:graphicFrameLocks xmlns:a="http://schemas.openxmlformats.org/drawingml/2006/main" noChangeAspect="1"/>
+            </wp:cNvGraphicFramePr>
+            <a:graphic xmlns:a="http://schemas.openxmlformats.org/drawingml/2006/main">
+              <a:graphicData uri="http://schemas.openxmlformats.org/drawingml/2006/picture">
+                <pic:pic xmlns:pic="http://schemas.openxmlformats.org/drawingml/2006/picture">
+                  <pic:nvPicPr>
+                    <pic:cNvPr id="0" name="" descr=""/>
+                    <pic:cNvPicPr>
+                      <a:picLocks noChangeAspect="1" noChangeArrowheads="1"/>
+                    </pic:cNvPicPr>
+                  </pic:nvPicPr>
+                  <pic:blipFill>
+                    <a:blip r:embed="rId8" cstate="none"/>
+                    <a:srcRect/>
+                    <a:stretch>
+                      <a:fillRect/>
+                    </a:stretch>
+                  </pic:blipFill>
+                  <pic:spPr bwMode="auto">
+                    <a:xfrm>
+                      <a:off x="0" y="0"/>
+                      <a:ext cx="3019425" cy="1428750"/>
+                    </a:xfrm>
+                    <a:prstGeom prst="rect">
+                      <a:avLst/>
+                    </a:prstGeom>
+                  </pic:spPr>
+                </pic:pic>
+              </a:graphicData>
+            </a:graphic>
+          </wp:inline>
+        </w:drawing>
+      </w:r>
+    </w:p>
     <w:p>
       <w:pPr>
         <w:spacing w:after="60" w:before="200"/>

</xml_diff>

<commit_message>
Mejora diseño del Word: espaciado, recuadro y fuentes en dos columnas
Portada con el profesor Trejo Muñoz Jesús Dolores y datos del alumno en
tabla. Cuerpo con más aire entre secciones, recuadro con relleno y fuentes
en dos columnas. Se mantienen 2 páginas de contenido más la portada.

Co-Authored-By: Claude <noreply@anthropic.com>
Claude-Session: https://claude.ai/code/session_01FQByZcxKiiViTFYyhYPaTh
</commit_message>
<xml_diff>
--- a/CAD2026/Normas_dibujo_tecnico_NOM_ISO_ANSI.docx
+++ b/CAD2026/Normas_dibujo_tecnico_NOM_ISO_ANSI.docx
@@ -4,12 +4,12 @@
   <w:body>
     <w:p>
       <w:pPr>
-        <w:spacing w:before="200"/>
-      </w:pPr>
-    </w:p>
-    <w:p>
-      <w:pPr>
-        <w:spacing w:after="200"/>
+        <w:spacing w:after="400"/>
+      </w:pPr>
+    </w:p>
+    <w:p>
+      <w:pPr>
+        <w:spacing w:after="360"/>
         <w:jc w:val="center"/>
       </w:pPr>
       <w:r>
@@ -55,15 +55,13 @@
     </w:p>
     <w:p>
       <w:pPr>
-        <w:spacing w:after="60" w:before="200"/>
+        <w:spacing w:after="80" w:before="0"/>
         <w:jc w:val="center"/>
       </w:pPr>
       <w:r>
         <w:rPr>
           <w:b/>
           <w:bCs/>
-          <w:i w:val="false"/>
-          <w:iCs w:val="false"/>
           <w:color w:val="1F4E79"/>
           <w:sz w:val="30"/>
           <w:szCs w:val="30"/>
@@ -73,15 +71,13 @@
     </w:p>
     <w:p>
       <w:pPr>
-        <w:spacing w:after="500" w:before="0"/>
+        <w:spacing w:after="560" w:before="0"/>
         <w:jc w:val="center"/>
       </w:pPr>
       <w:r>
         <w:rPr>
           <w:b w:val="false"/>
           <w:bCs w:val="false"/>
-          <w:i w:val="false"/>
-          <w:iCs w:val="false"/>
           <w:color w:val="5B6575"/>
           <w:sz w:val="20"/>
           <w:szCs w:val="20"/>
@@ -94,140 +90,342 @@
         <w:pBdr>
           <w:bottom w:val="single" w:color="1F4E79" w:sz="12" w:space="1"/>
         </w:pBdr>
-        <w:spacing w:after="500"/>
-      </w:pPr>
-    </w:p>
-    <w:p>
-      <w:pPr>
-        <w:spacing w:after="300" w:before="0"/>
+        <w:spacing w:after="560"/>
+      </w:pPr>
+    </w:p>
+    <w:p>
+      <w:pPr>
+        <w:spacing w:after="320" w:before="0"/>
         <w:jc w:val="center"/>
       </w:pPr>
       <w:r>
         <w:rPr>
           <w:b/>
           <w:bCs/>
-          <w:i w:val="false"/>
-          <w:iCs w:val="false"/>
-          <w:color w:val="5B6575"/>
+          <w:color w:val="5B6575"/>
+          <w:spacing w:val="30"/>
           <w:sz w:val="20"/>
           <w:szCs w:val="20"/>
         </w:rPr>
-        <w:t xml:space="preserve">CAD2026 · UNIDAD DE ANÁLISIS</w:t>
-      </w:r>
-    </w:p>
-    <w:p>
-      <w:pPr>
-        <w:spacing w:after="200" w:before="0"/>
+        <w:t xml:space="preserve">CAD2026  ·  UNIDAD DE ANÁLISIS</w:t>
+      </w:r>
+    </w:p>
+    <w:p>
+      <w:pPr>
+        <w:spacing w:after="0" w:before="0"/>
         <w:jc w:val="center"/>
       </w:pPr>
       <w:r>
         <w:rPr>
           <w:b/>
           <w:bCs/>
-          <w:i w:val="false"/>
-          <w:iCs w:val="false"/>
           <w:color w:val="1F4E79"/>
           <w:sz w:val="52"/>
           <w:szCs w:val="52"/>
         </w:rPr>
-        <w:t xml:space="preserve">Normas de dibujo técnico: NOM, ISO y ANSI</w:t>
-      </w:r>
-    </w:p>
-    <w:p>
-      <w:pPr>
-        <w:spacing w:after="900" w:before="0"/>
+        <w:t xml:space="preserve">Normas de dibujo técnico</w:t>
+      </w:r>
+    </w:p>
+    <w:p>
+      <w:pPr>
+        <w:spacing w:after="280" w:before="0"/>
+        <w:jc w:val="center"/>
+      </w:pPr>
+      <w:r>
+        <w:rPr>
+          <w:b/>
+          <w:bCs/>
+          <w:color w:val="1F4E79"/>
+          <w:sz w:val="52"/>
+          <w:szCs w:val="52"/>
+        </w:rPr>
+        <w:t xml:space="preserve">NOM, ISO y ANSI</w:t>
+      </w:r>
+    </w:p>
+    <w:p>
+      <w:pPr>
+        <w:spacing w:after="760" w:before="0"/>
         <w:jc w:val="center"/>
       </w:pPr>
       <w:r>
         <w:rPr>
           <w:b w:val="false"/>
           <w:bCs w:val="false"/>
-          <w:i w:val="false"/>
-          <w:iCs w:val="false"/>
-          <w:color w:val="5B6575"/>
-          <w:sz w:val="26"/>
-          <w:szCs w:val="26"/>
+          <w:color w:val="5B6575"/>
+          <w:sz w:val="24"/>
+          <w:szCs w:val="24"/>
         </w:rPr>
         <w:t xml:space="preserve">Comparativa de organismos y normas para planos de ingeniería</w:t>
       </w:r>
     </w:p>
-    <w:p>
-      <w:pPr>
-        <w:spacing w:after="220" w:before="0"/>
+    <w:tbl>
+      <w:tblPr>
+        <w:tblW w:type="dxa" w:w="7600"/>
         <w:jc w:val="center"/>
-      </w:pPr>
-      <w:r>
-        <w:rPr>
-          <w:b w:val="false"/>
-          <w:bCs w:val="false"/>
-          <w:i w:val="false"/>
-          <w:iCs w:val="false"/>
-          <w:color w:val="1D2430"/>
-          <w:sz w:val="22"/>
-          <w:szCs w:val="22"/>
-        </w:rPr>
-        <w:t xml:space="preserve">Alumno(a): Pablo Antonio Esquivel Soria</w:t>
-      </w:r>
-    </w:p>
-    <w:p>
-      <w:pPr>
-        <w:spacing w:after="220" w:before="0"/>
-        <w:jc w:val="center"/>
-      </w:pPr>
-      <w:r>
-        <w:rPr>
-          <w:b w:val="false"/>
-          <w:bCs w:val="false"/>
-          <w:i w:val="false"/>
-          <w:iCs w:val="false"/>
-          <w:color w:val="1D2430"/>
-          <w:sz w:val="22"/>
-          <w:szCs w:val="22"/>
-        </w:rPr>
-        <w:t xml:space="preserve">Número de control: 22110961</w:t>
-      </w:r>
-    </w:p>
-    <w:p>
-      <w:pPr>
-        <w:spacing w:after="220" w:before="0"/>
-        <w:jc w:val="center"/>
-      </w:pPr>
-      <w:r>
-        <w:rPr>
-          <w:b w:val="false"/>
-          <w:bCs w:val="false"/>
-          <w:i w:val="false"/>
-          <w:iCs w:val="false"/>
-          <w:color w:val="1D2430"/>
-          <w:sz w:val="22"/>
-          <w:szCs w:val="22"/>
-        </w:rPr>
-        <w:t xml:space="preserve">Profesor(a): ______________________________________</w:t>
-      </w:r>
-    </w:p>
-    <w:p>
-      <w:pPr>
-        <w:spacing w:after="0" w:before="0"/>
-        <w:jc w:val="center"/>
-      </w:pPr>
-      <w:r>
-        <w:rPr>
-          <w:b w:val="false"/>
-          <w:bCs w:val="false"/>
-          <w:i w:val="false"/>
-          <w:iCs w:val="false"/>
-          <w:color w:val="1D2430"/>
-          <w:sz w:val="22"/>
-          <w:szCs w:val="22"/>
-        </w:rPr>
-        <w:t xml:space="preserve">Fecha: 10 de octubre de 2026</w:t>
-      </w:r>
-    </w:p>
+        <w:tblBorders>
+          <w:top w:val="none" w:color="FFFFFF" w:sz="0"/>
+          <w:left w:val="none" w:color="FFFFFF" w:sz="0"/>
+          <w:bottom w:val="none" w:color="FFFFFF" w:sz="0"/>
+          <w:right w:val="none" w:color="FFFFFF" w:sz="0"/>
+          <w:insideH w:val="none" w:color="FFFFFF" w:sz="0"/>
+          <w:insideV w:val="none" w:color="FFFFFF" w:sz="0"/>
+        </w:tblBorders>
+        <w:tblLayout w:type="fixed"/>
+      </w:tblPr>
+      <w:tblGrid>
+        <w:gridCol w:w="2600"/>
+        <w:gridCol w:w="5000"/>
+      </w:tblGrid>
+      <w:tr>
+        <w:tc>
+          <w:tcPr>
+            <w:tcW w:type="dxa" w:w="2600"/>
+            <w:tcBorders>
+              <w:top w:val="none" w:color="FFFFFF" w:sz="0"/>
+              <w:left w:val="none" w:color="FFFFFF" w:sz="0"/>
+              <w:bottom w:val="none" w:color="FFFFFF" w:sz="0"/>
+              <w:right w:val="none" w:color="FFFFFF" w:sz="0"/>
+            </w:tcBorders>
+            <w:tcMar>
+              <w:top w:type="dxa" w:w="110"/>
+              <w:left w:type="dxa" w:w="0"/>
+              <w:bottom w:type="dxa" w:w="110"/>
+              <w:right w:type="dxa" w:w="160"/>
+            </w:tcMar>
+          </w:tcPr>
+          <w:p>
+            <w:pPr>
+              <w:jc w:val="right"/>
+            </w:pPr>
+            <w:r>
+              <w:rPr>
+                <w:b/>
+                <w:bCs/>
+                <w:color w:val="1F4E79"/>
+                <w:sz w:val="21"/>
+                <w:szCs w:val="21"/>
+              </w:rPr>
+              <w:t xml:space="preserve">Alumno(a):</w:t>
+            </w:r>
+          </w:p>
+        </w:tc>
+        <w:tc>
+          <w:tcPr>
+            <w:tcW w:type="dxa" w:w="5000"/>
+            <w:tcBorders>
+              <w:top w:val="none" w:color="FFFFFF" w:sz="0"/>
+              <w:left w:val="none" w:color="FFFFFF" w:sz="0"/>
+              <w:bottom w:val="single" w:color="C9D3DF" w:sz="6"/>
+              <w:right w:val="none" w:color="FFFFFF" w:sz="0"/>
+            </w:tcBorders>
+            <w:tcMar>
+              <w:top w:type="dxa" w:w="110"/>
+              <w:left w:type="dxa" w:w="160"/>
+              <w:bottom w:type="dxa" w:w="110"/>
+              <w:right w:type="dxa" w:w="0"/>
+            </w:tcMar>
+          </w:tcPr>
+          <w:p>
+            <w:r>
+              <w:rPr>
+                <w:color w:val="1D2430"/>
+                <w:sz w:val="21"/>
+                <w:szCs w:val="21"/>
+              </w:rPr>
+              <w:t xml:space="preserve">Pablo Antonio Esquivel Soria</w:t>
+            </w:r>
+          </w:p>
+        </w:tc>
+      </w:tr>
+      <w:tr>
+        <w:tc>
+          <w:tcPr>
+            <w:tcW w:type="dxa" w:w="2600"/>
+            <w:tcBorders>
+              <w:top w:val="none" w:color="FFFFFF" w:sz="0"/>
+              <w:left w:val="none" w:color="FFFFFF" w:sz="0"/>
+              <w:bottom w:val="none" w:color="FFFFFF" w:sz="0"/>
+              <w:right w:val="none" w:color="FFFFFF" w:sz="0"/>
+            </w:tcBorders>
+            <w:tcMar>
+              <w:top w:type="dxa" w:w="110"/>
+              <w:left w:type="dxa" w:w="0"/>
+              <w:bottom w:type="dxa" w:w="110"/>
+              <w:right w:type="dxa" w:w="160"/>
+            </w:tcMar>
+          </w:tcPr>
+          <w:p>
+            <w:pPr>
+              <w:jc w:val="right"/>
+            </w:pPr>
+            <w:r>
+              <w:rPr>
+                <w:b/>
+                <w:bCs/>
+                <w:color w:val="1F4E79"/>
+                <w:sz w:val="21"/>
+                <w:szCs w:val="21"/>
+              </w:rPr>
+              <w:t xml:space="preserve">Número de control:</w:t>
+            </w:r>
+          </w:p>
+        </w:tc>
+        <w:tc>
+          <w:tcPr>
+            <w:tcW w:type="dxa" w:w="5000"/>
+            <w:tcBorders>
+              <w:top w:val="none" w:color="FFFFFF" w:sz="0"/>
+              <w:left w:val="none" w:color="FFFFFF" w:sz="0"/>
+              <w:bottom w:val="single" w:color="C9D3DF" w:sz="6"/>
+              <w:right w:val="none" w:color="FFFFFF" w:sz="0"/>
+            </w:tcBorders>
+            <w:tcMar>
+              <w:top w:type="dxa" w:w="110"/>
+              <w:left w:type="dxa" w:w="160"/>
+              <w:bottom w:type="dxa" w:w="110"/>
+              <w:right w:type="dxa" w:w="0"/>
+            </w:tcMar>
+          </w:tcPr>
+          <w:p>
+            <w:r>
+              <w:rPr>
+                <w:color w:val="1D2430"/>
+                <w:sz w:val="21"/>
+                <w:szCs w:val="21"/>
+              </w:rPr>
+              <w:t xml:space="preserve">22110961</w:t>
+            </w:r>
+          </w:p>
+        </w:tc>
+      </w:tr>
+      <w:tr>
+        <w:tc>
+          <w:tcPr>
+            <w:tcW w:type="dxa" w:w="2600"/>
+            <w:tcBorders>
+              <w:top w:val="none" w:color="FFFFFF" w:sz="0"/>
+              <w:left w:val="none" w:color="FFFFFF" w:sz="0"/>
+              <w:bottom w:val="none" w:color="FFFFFF" w:sz="0"/>
+              <w:right w:val="none" w:color="FFFFFF" w:sz="0"/>
+            </w:tcBorders>
+            <w:tcMar>
+              <w:top w:type="dxa" w:w="110"/>
+              <w:left w:type="dxa" w:w="0"/>
+              <w:bottom w:type="dxa" w:w="110"/>
+              <w:right w:type="dxa" w:w="160"/>
+            </w:tcMar>
+          </w:tcPr>
+          <w:p>
+            <w:pPr>
+              <w:jc w:val="right"/>
+            </w:pPr>
+            <w:r>
+              <w:rPr>
+                <w:b/>
+                <w:bCs/>
+                <w:color w:val="1F4E79"/>
+                <w:sz w:val="21"/>
+                <w:szCs w:val="21"/>
+              </w:rPr>
+              <w:t xml:space="preserve">Profesor:</w:t>
+            </w:r>
+          </w:p>
+        </w:tc>
+        <w:tc>
+          <w:tcPr>
+            <w:tcW w:type="dxa" w:w="5000"/>
+            <w:tcBorders>
+              <w:top w:val="none" w:color="FFFFFF" w:sz="0"/>
+              <w:left w:val="none" w:color="FFFFFF" w:sz="0"/>
+              <w:bottom w:val="single" w:color="C9D3DF" w:sz="6"/>
+              <w:right w:val="none" w:color="FFFFFF" w:sz="0"/>
+            </w:tcBorders>
+            <w:tcMar>
+              <w:top w:type="dxa" w:w="110"/>
+              <w:left w:type="dxa" w:w="160"/>
+              <w:bottom w:type="dxa" w:w="110"/>
+              <w:right w:type="dxa" w:w="0"/>
+            </w:tcMar>
+          </w:tcPr>
+          <w:p>
+            <w:r>
+              <w:rPr>
+                <w:color w:val="1D2430"/>
+                <w:sz w:val="21"/>
+                <w:szCs w:val="21"/>
+              </w:rPr>
+              <w:t xml:space="preserve">TREJO MUÑOZ JESÚS DOLORES</w:t>
+            </w:r>
+          </w:p>
+        </w:tc>
+      </w:tr>
+      <w:tr>
+        <w:tc>
+          <w:tcPr>
+            <w:tcW w:type="dxa" w:w="2600"/>
+            <w:tcBorders>
+              <w:top w:val="none" w:color="FFFFFF" w:sz="0"/>
+              <w:left w:val="none" w:color="FFFFFF" w:sz="0"/>
+              <w:bottom w:val="none" w:color="FFFFFF" w:sz="0"/>
+              <w:right w:val="none" w:color="FFFFFF" w:sz="0"/>
+            </w:tcBorders>
+            <w:tcMar>
+              <w:top w:type="dxa" w:w="110"/>
+              <w:left w:type="dxa" w:w="0"/>
+              <w:bottom w:type="dxa" w:w="110"/>
+              <w:right w:type="dxa" w:w="160"/>
+            </w:tcMar>
+          </w:tcPr>
+          <w:p>
+            <w:pPr>
+              <w:jc w:val="right"/>
+            </w:pPr>
+            <w:r>
+              <w:rPr>
+                <w:b/>
+                <w:bCs/>
+                <w:color w:val="1F4E79"/>
+                <w:sz w:val="21"/>
+                <w:szCs w:val="21"/>
+              </w:rPr>
+              <w:t xml:space="preserve">Fecha:</w:t>
+            </w:r>
+          </w:p>
+        </w:tc>
+        <w:tc>
+          <w:tcPr>
+            <w:tcW w:type="dxa" w:w="5000"/>
+            <w:tcBorders>
+              <w:top w:val="none" w:color="FFFFFF" w:sz="0"/>
+              <w:left w:val="none" w:color="FFFFFF" w:sz="0"/>
+              <w:bottom w:val="single" w:color="C9D3DF" w:sz="6"/>
+              <w:right w:val="none" w:color="FFFFFF" w:sz="0"/>
+            </w:tcBorders>
+            <w:tcMar>
+              <w:top w:type="dxa" w:w="110"/>
+              <w:left w:type="dxa" w:w="160"/>
+              <w:bottom w:type="dxa" w:w="110"/>
+              <w:right w:type="dxa" w:w="0"/>
+            </w:tcMar>
+          </w:tcPr>
+          <w:p>
+            <w:r>
+              <w:rPr>
+                <w:color w:val="1D2430"/>
+                <w:sz w:val="21"/>
+                <w:szCs w:val="21"/>
+              </w:rPr>
+              <w:t xml:space="preserve">10 de octubre de 2026</w:t>
+            </w:r>
+          </w:p>
+        </w:tc>
+      </w:tr>
+    </w:tbl>
     <w:p>
       <w:pPr>
         <w:sectPr>
           <w:pgSz w:w="12240" w:h="15840" w:orient="portrait"/>
-          <w:pgMar w:top="1440" w:right="1440" w:bottom="1440" w:left="1440" w:header="708" w:footer="708" w:gutter="0"/>
+          <w:pgMar w:top="1080" w:right="1080" w:bottom="1080" w:left="1080" w:header="708" w:footer="708" w:gutter="0"/>
           <w:pgNumType/>
           <w:docGrid w:linePitch="360"/>
         </w:sectPr>
@@ -236,9 +434,9 @@
     <w:p>
       <w:pPr>
         <w:pBdr>
-          <w:bottom w:val="single" w:color="1F4E79" w:sz="6" w:space="3"/>
+          <w:bottom w:val="single" w:color="1F4E79" w:sz="6" w:space="4"/>
         </w:pBdr>
-        <w:spacing w:after="160"/>
+        <w:spacing w:after="200"/>
       </w:pPr>
       <w:r>
         <w:rPr>
@@ -246,7 +444,7 @@
           <w:sz w:val="16"/>
           <w:szCs w:val="16"/>
         </w:rPr>
-        <w:t xml:space="preserve">CAD2026 · Normas de dibujo técnico: NOM, ISO y ANSI</w:t>
+        <w:t xml:space="preserve">CAD2026  ·  Normas de dibujo técnico: NOM, ISO y ANSI</w:t>
       </w:r>
     </w:p>
     <w:p>
@@ -259,7 +457,7 @@
     </w:p>
     <w:p>
       <w:pPr>
-        <w:spacing w:after="80" w:line="264"/>
+        <w:spacing w:after="100" w:line="264"/>
         <w:jc w:val="both"/>
       </w:pPr>
       <w:r>
@@ -293,10 +491,10 @@
       </w:tblPr>
       <w:tblGrid>
         <w:gridCol w:w="1150"/>
-        <w:gridCol w:w="2150"/>
         <w:gridCol w:w="2000"/>
-        <w:gridCol w:w="2480"/>
-        <w:gridCol w:w="2300"/>
+        <w:gridCol w:w="1750"/>
+        <w:gridCol w:w="2400"/>
+        <w:gridCol w:w="2780"/>
       </w:tblGrid>
       <w:tr>
         <w:trPr>
@@ -307,23 +505,24 @@
             <w:tcW w:type="dxa" w:w="1150"/>
             <w:shd w:fill="1F4E79" w:color="auto" w:val="clear"/>
             <w:tcMar>
-              <w:top w:type="dxa" w:w="45"/>
-              <w:left w:type="dxa" w:w="80"/>
-              <w:bottom w:type="dxa" w:w="45"/>
-              <w:right w:type="dxa" w:w="80"/>
-            </w:tcMar>
-          </w:tcPr>
-          <w:p>
-            <w:pPr>
-              <w:spacing w:after="0" w:line="240"/>
+              <w:top w:type="dxa" w:w="75"/>
+              <w:left w:type="dxa" w:w="120"/>
+              <w:bottom w:type="dxa" w:w="75"/>
+              <w:right w:type="dxa" w:w="120"/>
+            </w:tcMar>
+            <w:vAlign w:val="center"/>
+          </w:tcPr>
+          <w:p>
+            <w:pPr>
+              <w:spacing w:after="0" w:line="255"/>
             </w:pPr>
             <w:r>
               <w:rPr>
                 <w:b/>
                 <w:bCs/>
                 <w:color w:val="FFFFFF"/>
-                <w:sz w:val="16"/>
-                <w:szCs w:val="16"/>
+                <w:sz w:val="17"/>
+                <w:szCs w:val="17"/>
               </w:rPr>
               <w:t xml:space="preserve">Organismo</w:t>
             </w:r>
@@ -331,26 +530,27 @@
         </w:tc>
         <w:tc>
           <w:tcPr>
-            <w:tcW w:type="dxa" w:w="2150"/>
+            <w:tcW w:type="dxa" w:w="2000"/>
             <w:shd w:fill="1F4E79" w:color="auto" w:val="clear"/>
             <w:tcMar>
-              <w:top w:type="dxa" w:w="45"/>
-              <w:left w:type="dxa" w:w="80"/>
-              <w:bottom w:type="dxa" w:w="45"/>
-              <w:right w:type="dxa" w:w="80"/>
-            </w:tcMar>
-          </w:tcPr>
-          <w:p>
-            <w:pPr>
-              <w:spacing w:after="0" w:line="240"/>
+              <w:top w:type="dxa" w:w="75"/>
+              <w:left w:type="dxa" w:w="120"/>
+              <w:bottom w:type="dxa" w:w="75"/>
+              <w:right w:type="dxa" w:w="120"/>
+            </w:tcMar>
+            <w:vAlign w:val="center"/>
+          </w:tcPr>
+          <w:p>
+            <w:pPr>
+              <w:spacing w:after="0" w:line="255"/>
             </w:pPr>
             <w:r>
               <w:rPr>
                 <w:b/>
                 <w:bCs/>
                 <w:color w:val="FFFFFF"/>
-                <w:sz w:val="16"/>
-                <w:szCs w:val="16"/>
+                <w:sz w:val="17"/>
+                <w:szCs w:val="17"/>
               </w:rPr>
               <w:t xml:space="preserve">Nombre completo</w:t>
             </w:r>
@@ -358,26 +558,27 @@
         </w:tc>
         <w:tc>
           <w:tcPr>
-            <w:tcW w:type="dxa" w:w="2000"/>
+            <w:tcW w:type="dxa" w:w="1750"/>
             <w:shd w:fill="1F4E79" w:color="auto" w:val="clear"/>
             <w:tcMar>
-              <w:top w:type="dxa" w:w="45"/>
-              <w:left w:type="dxa" w:w="80"/>
-              <w:bottom w:type="dxa" w:w="45"/>
-              <w:right w:type="dxa" w:w="80"/>
-            </w:tcMar>
-          </w:tcPr>
-          <w:p>
-            <w:pPr>
-              <w:spacing w:after="0" w:line="240"/>
+              <w:top w:type="dxa" w:w="75"/>
+              <w:left w:type="dxa" w:w="120"/>
+              <w:bottom w:type="dxa" w:w="75"/>
+              <w:right w:type="dxa" w:w="120"/>
+            </w:tcMar>
+            <w:vAlign w:val="center"/>
+          </w:tcPr>
+          <w:p>
+            <w:pPr>
+              <w:spacing w:after="0" w:line="255"/>
             </w:pPr>
             <w:r>
               <w:rPr>
                 <w:b/>
                 <w:bCs/>
                 <w:color w:val="FFFFFF"/>
-                <w:sz w:val="16"/>
-                <w:szCs w:val="16"/>
+                <w:sz w:val="17"/>
+                <w:szCs w:val="17"/>
               </w:rPr>
               <w:t xml:space="preserve">País o ámbito</w:t>
             </w:r>
@@ -385,26 +586,27 @@
         </w:tc>
         <w:tc>
           <w:tcPr>
-            <w:tcW w:type="dxa" w:w="2480"/>
+            <w:tcW w:type="dxa" w:w="2400"/>
             <w:shd w:fill="1F4E79" w:color="auto" w:val="clear"/>
             <w:tcMar>
-              <w:top w:type="dxa" w:w="45"/>
-              <w:left w:type="dxa" w:w="80"/>
-              <w:bottom w:type="dxa" w:w="45"/>
-              <w:right w:type="dxa" w:w="80"/>
-            </w:tcMar>
-          </w:tcPr>
-          <w:p>
-            <w:pPr>
-              <w:spacing w:after="0" w:line="240"/>
+              <w:top w:type="dxa" w:w="75"/>
+              <w:left w:type="dxa" w:w="120"/>
+              <w:bottom w:type="dxa" w:w="75"/>
+              <w:right w:type="dxa" w:w="120"/>
+            </w:tcMar>
+            <w:vAlign w:val="center"/>
+          </w:tcPr>
+          <w:p>
+            <w:pPr>
+              <w:spacing w:after="0" w:line="255"/>
             </w:pPr>
             <w:r>
               <w:rPr>
                 <w:b/>
                 <w:bCs/>
                 <w:color w:val="FFFFFF"/>
-                <w:sz w:val="16"/>
-                <w:szCs w:val="16"/>
+                <w:sz w:val="17"/>
+                <w:szCs w:val="17"/>
               </w:rPr>
               <w:t xml:space="preserve">Propósito</w:t>
             </w:r>
@@ -412,26 +614,27 @@
         </w:tc>
         <w:tc>
           <w:tcPr>
-            <w:tcW w:type="dxa" w:w="2300"/>
+            <w:tcW w:type="dxa" w:w="2780"/>
             <w:shd w:fill="1F4E79" w:color="auto" w:val="clear"/>
             <w:tcMar>
-              <w:top w:type="dxa" w:w="45"/>
-              <w:left w:type="dxa" w:w="80"/>
-              <w:bottom w:type="dxa" w:w="45"/>
-              <w:right w:type="dxa" w:w="80"/>
-            </w:tcMar>
-          </w:tcPr>
-          <w:p>
-            <w:pPr>
-              <w:spacing w:after="0" w:line="240"/>
+              <w:top w:type="dxa" w:w="75"/>
+              <w:left w:type="dxa" w:w="120"/>
+              <w:bottom w:type="dxa" w:w="75"/>
+              <w:right w:type="dxa" w:w="120"/>
+            </w:tcMar>
+            <w:vAlign w:val="center"/>
+          </w:tcPr>
+          <w:p>
+            <w:pPr>
+              <w:spacing w:after="0" w:line="255"/>
             </w:pPr>
             <w:r>
               <w:rPr>
                 <w:b/>
                 <w:bCs/>
                 <w:color w:val="FFFFFF"/>
-                <w:sz w:val="16"/>
-                <w:szCs w:val="16"/>
+                <w:sz w:val="17"/>
+                <w:szCs w:val="17"/>
               </w:rPr>
               <w:t xml:space="preserve">Ejemplo de aplicación en dibujo o manufactura</w:t>
             </w:r>
@@ -446,22 +649,23 @@
           <w:tcPr>
             <w:tcW w:type="dxa" w:w="1150"/>
             <w:tcMar>
-              <w:top w:type="dxa" w:w="45"/>
-              <w:left w:type="dxa" w:w="80"/>
-              <w:bottom w:type="dxa" w:w="45"/>
-              <w:right w:type="dxa" w:w="80"/>
-            </w:tcMar>
-          </w:tcPr>
-          <w:p>
-            <w:pPr>
-              <w:spacing w:after="0" w:line="240"/>
+              <w:top w:type="dxa" w:w="75"/>
+              <w:left w:type="dxa" w:w="120"/>
+              <w:bottom w:type="dxa" w:w="75"/>
+              <w:right w:type="dxa" w:w="120"/>
+            </w:tcMar>
+            <w:vAlign w:val="center"/>
+          </w:tcPr>
+          <w:p>
+            <w:pPr>
+              <w:spacing w:after="0" w:line="255"/>
             </w:pPr>
             <w:r>
               <w:rPr>
                 <w:b/>
                 <w:bCs/>
-                <w:sz w:val="16"/>
-                <w:szCs w:val="16"/>
+                <w:sz w:val="17"/>
+                <w:szCs w:val="17"/>
               </w:rPr>
               <w:t xml:space="preserve">NOM / NMX</w:t>
             </w:r>
@@ -469,22 +673,23 @@
         </w:tc>
         <w:tc>
           <w:tcPr>
-            <w:tcW w:type="dxa" w:w="2150"/>
-            <w:tcMar>
-              <w:top w:type="dxa" w:w="45"/>
-              <w:left w:type="dxa" w:w="80"/>
-              <w:bottom w:type="dxa" w:w="45"/>
-              <w:right w:type="dxa" w:w="80"/>
-            </w:tcMar>
-          </w:tcPr>
-          <w:p>
-            <w:pPr>
-              <w:spacing w:after="0" w:line="240"/>
-            </w:pPr>
-            <w:r>
-              <w:rPr>
-                <w:sz w:val="16"/>
-                <w:szCs w:val="16"/>
+            <w:tcW w:type="dxa" w:w="2000"/>
+            <w:tcMar>
+              <w:top w:type="dxa" w:w="75"/>
+              <w:left w:type="dxa" w:w="120"/>
+              <w:bottom w:type="dxa" w:w="75"/>
+              <w:right w:type="dxa" w:w="120"/>
+            </w:tcMar>
+            <w:vAlign w:val="center"/>
+          </w:tcPr>
+          <w:p>
+            <w:pPr>
+              <w:spacing w:after="0" w:line="255"/>
+            </w:pPr>
+            <w:r>
+              <w:rPr>
+                <w:sz w:val="17"/>
+                <w:szCs w:val="17"/>
               </w:rPr>
               <w:t xml:space="preserve">Norma Oficial Mexicana (NOM) y Norma Mexicana (NMX)</w:t>
             </w:r>
@@ -492,22 +697,23 @@
         </w:tc>
         <w:tc>
           <w:tcPr>
-            <w:tcW w:type="dxa" w:w="2000"/>
-            <w:tcMar>
-              <w:top w:type="dxa" w:w="45"/>
-              <w:left w:type="dxa" w:w="80"/>
-              <w:bottom w:type="dxa" w:w="45"/>
-              <w:right w:type="dxa" w:w="80"/>
-            </w:tcMar>
-          </w:tcPr>
-          <w:p>
-            <w:pPr>
-              <w:spacing w:after="0" w:line="240"/>
-            </w:pPr>
-            <w:r>
-              <w:rPr>
-                <w:sz w:val="16"/>
-                <w:szCs w:val="16"/>
+            <w:tcW w:type="dxa" w:w="1750"/>
+            <w:tcMar>
+              <w:top w:type="dxa" w:w="75"/>
+              <w:left w:type="dxa" w:w="120"/>
+              <w:bottom w:type="dxa" w:w="75"/>
+              <w:right w:type="dxa" w:w="120"/>
+            </w:tcMar>
+            <w:vAlign w:val="center"/>
+          </w:tcPr>
+          <w:p>
+            <w:pPr>
+              <w:spacing w:after="0" w:line="255"/>
+            </w:pPr>
+            <w:r>
+              <w:rPr>
+                <w:sz w:val="17"/>
+                <w:szCs w:val="17"/>
               </w:rPr>
               <w:t xml:space="preserve">México. Las NOM son de observancia obligatoria; las NMX son voluntarias.</w:t>
             </w:r>
@@ -515,30 +721,31 @@
         </w:tc>
         <w:tc>
           <w:tcPr>
-            <w:tcW w:type="dxa" w:w="2480"/>
-            <w:tcMar>
-              <w:top w:type="dxa" w:w="45"/>
-              <w:left w:type="dxa" w:w="80"/>
-              <w:bottom w:type="dxa" w:w="45"/>
-              <w:right w:type="dxa" w:w="80"/>
-            </w:tcMar>
-          </w:tcPr>
-          <w:p>
-            <w:pPr>
-              <w:spacing w:after="0" w:line="240"/>
-            </w:pPr>
-            <w:r>
-              <w:rPr>
-                <w:sz w:val="16"/>
-                <w:szCs w:val="16"/>
+            <w:tcW w:type="dxa" w:w="2400"/>
+            <w:tcMar>
+              <w:top w:type="dxa" w:w="75"/>
+              <w:left w:type="dxa" w:w="120"/>
+              <w:bottom w:type="dxa" w:w="75"/>
+              <w:right w:type="dxa" w:w="120"/>
+            </w:tcMar>
+            <w:vAlign w:val="center"/>
+          </w:tcPr>
+          <w:p>
+            <w:pPr>
+              <w:spacing w:after="0" w:line="255"/>
+            </w:pPr>
+            <w:r>
+              <w:rPr>
+                <w:sz w:val="17"/>
+                <w:szCs w:val="17"/>
               </w:rPr>
               <w:t xml:space="preserve">Establecer requisitos técnicos obligatorios (NOM) y referencias voluntarias (NMX). La Secretaría de Economía las coordina y se publican en el Diario Oficial de la Federación. </w:t>
             </w:r>
             <w:r>
               <w:rPr>
                 <w:color w:val="5B6575"/>
-                <w:sz w:val="13"/>
-                <w:szCs w:val="13"/>
+                <w:sz w:val="14"/>
+                <w:szCs w:val="14"/>
               </w:rPr>
               <w:t xml:space="preserve">[1]</w:t>
             </w:r>
@@ -546,52 +753,53 @@
         </w:tc>
         <w:tc>
           <w:tcPr>
-            <w:tcW w:type="dxa" w:w="2300"/>
-            <w:tcMar>
-              <w:top w:type="dxa" w:w="45"/>
-              <w:left w:type="dxa" w:w="80"/>
-              <w:bottom w:type="dxa" w:w="45"/>
-              <w:right w:type="dxa" w:w="80"/>
-            </w:tcMar>
-          </w:tcPr>
-          <w:p>
-            <w:pPr>
-              <w:spacing w:after="0" w:line="240"/>
-            </w:pPr>
-            <w:r>
-              <w:rPr>
-                <w:sz w:val="16"/>
-                <w:szCs w:val="16"/>
+            <w:tcW w:type="dxa" w:w="2780"/>
+            <w:tcMar>
+              <w:top w:type="dxa" w:w="75"/>
+              <w:left w:type="dxa" w:w="120"/>
+              <w:bottom w:type="dxa" w:w="75"/>
+              <w:right w:type="dxa" w:w="120"/>
+            </w:tcMar>
+            <w:vAlign w:val="center"/>
+          </w:tcPr>
+          <w:p>
+            <w:pPr>
+              <w:spacing w:after="0" w:line="255"/>
+            </w:pPr>
+            <w:r>
+              <w:rPr>
+                <w:sz w:val="17"/>
+                <w:szCs w:val="17"/>
               </w:rPr>
               <w:t xml:space="preserve">NOM-008-SE-2021, sistema general de unidades de medida, que cancela a la NOM-008-SCFI-2002. </w:t>
             </w:r>
             <w:r>
               <w:rPr>
                 <w:color w:val="5B6575"/>
-                <w:sz w:val="13"/>
-                <w:szCs w:val="13"/>
+                <w:sz w:val="14"/>
+                <w:szCs w:val="14"/>
               </w:rPr>
               <w:t xml:space="preserve">[1]</w:t>
             </w:r>
             <w:r>
               <w:rPr>
-                <w:sz w:val="16"/>
-                <w:szCs w:val="16"/>
+                <w:sz w:val="17"/>
+                <w:szCs w:val="17"/>
               </w:rPr>
               <w:t xml:space="preserve"> NMX-DT-128-30-IMNC-2010, convenciones básicas para vistas. </w:t>
             </w:r>
             <w:r>
               <w:rPr>
                 <w:color w:val="5B6575"/>
-                <w:sz w:val="13"/>
-                <w:szCs w:val="13"/>
+                <w:sz w:val="14"/>
+                <w:szCs w:val="14"/>
               </w:rPr>
               <w:t xml:space="preserve">[2]</w:t>
             </w:r>
             <w:r>
               <w:rPr>
-                <w:sz w:val="16"/>
-                <w:szCs w:val="16"/>
+                <w:sz w:val="17"/>
+                <w:szCs w:val="17"/>
               </w:rPr>
               <w:t xml:space="preserve"> No se encontró una NOM específica para dibujo técnico.</w:t>
             </w:r>
@@ -607,48 +815,25 @@
             <w:tcW w:type="dxa" w:w="1150"/>
             <w:shd w:fill="EAF1F8" w:color="auto" w:val="clear"/>
             <w:tcMar>
-              <w:top w:type="dxa" w:w="45"/>
-              <w:left w:type="dxa" w:w="80"/>
-              <w:bottom w:type="dxa" w:w="45"/>
-              <w:right w:type="dxa" w:w="80"/>
-            </w:tcMar>
-          </w:tcPr>
-          <w:p>
-            <w:pPr>
-              <w:spacing w:after="0" w:line="240"/>
+              <w:top w:type="dxa" w:w="75"/>
+              <w:left w:type="dxa" w:w="120"/>
+              <w:bottom w:type="dxa" w:w="75"/>
+              <w:right w:type="dxa" w:w="120"/>
+            </w:tcMar>
+            <w:vAlign w:val="center"/>
+          </w:tcPr>
+          <w:p>
+            <w:pPr>
+              <w:spacing w:after="0" w:line="255"/>
             </w:pPr>
             <w:r>
               <w:rPr>
                 <w:b/>
                 <w:bCs/>
-                <w:sz w:val="16"/>
-                <w:szCs w:val="16"/>
+                <w:sz w:val="17"/>
+                <w:szCs w:val="17"/>
               </w:rPr>
               <w:t xml:space="preserve">ISO</w:t>
-            </w:r>
-          </w:p>
-        </w:tc>
-        <w:tc>
-          <w:tcPr>
-            <w:tcW w:type="dxa" w:w="2150"/>
-            <w:shd w:fill="EAF1F8" w:color="auto" w:val="clear"/>
-            <w:tcMar>
-              <w:top w:type="dxa" w:w="45"/>
-              <w:left w:type="dxa" w:w="80"/>
-              <w:bottom w:type="dxa" w:w="45"/>
-              <w:right w:type="dxa" w:w="80"/>
-            </w:tcMar>
-          </w:tcPr>
-          <w:p>
-            <w:pPr>
-              <w:spacing w:after="0" w:line="240"/>
-            </w:pPr>
-            <w:r>
-              <w:rPr>
-                <w:sz w:val="16"/>
-                <w:szCs w:val="16"/>
-              </w:rPr>
-              <w:t xml:space="preserve">International Organization for Standardization (Organización Internacional de Normalización)</w:t>
             </w:r>
           </w:p>
         </w:tc>
@@ -657,20 +842,46 @@
             <w:tcW w:type="dxa" w:w="2000"/>
             <w:shd w:fill="EAF1F8" w:color="auto" w:val="clear"/>
             <w:tcMar>
-              <w:top w:type="dxa" w:w="45"/>
-              <w:left w:type="dxa" w:w="80"/>
-              <w:bottom w:type="dxa" w:w="45"/>
-              <w:right w:type="dxa" w:w="80"/>
-            </w:tcMar>
-          </w:tcPr>
-          <w:p>
-            <w:pPr>
-              <w:spacing w:after="0" w:line="240"/>
-            </w:pPr>
-            <w:r>
-              <w:rPr>
-                <w:sz w:val="16"/>
-                <w:szCs w:val="16"/>
+              <w:top w:type="dxa" w:w="75"/>
+              <w:left w:type="dxa" w:w="120"/>
+              <w:bottom w:type="dxa" w:w="75"/>
+              <w:right w:type="dxa" w:w="120"/>
+            </w:tcMar>
+            <w:vAlign w:val="center"/>
+          </w:tcPr>
+          <w:p>
+            <w:pPr>
+              <w:spacing w:after="0" w:line="255"/>
+            </w:pPr>
+            <w:r>
+              <w:rPr>
+                <w:sz w:val="17"/>
+                <w:szCs w:val="17"/>
+              </w:rPr>
+              <w:t xml:space="preserve">International Organization for Standardization (Organización Internacional de Normalización)</w:t>
+            </w:r>
+          </w:p>
+        </w:tc>
+        <w:tc>
+          <w:tcPr>
+            <w:tcW w:type="dxa" w:w="1750"/>
+            <w:shd w:fill="EAF1F8" w:color="auto" w:val="clear"/>
+            <w:tcMar>
+              <w:top w:type="dxa" w:w="75"/>
+              <w:left w:type="dxa" w:w="120"/>
+              <w:bottom w:type="dxa" w:w="75"/>
+              <w:right w:type="dxa" w:w="120"/>
+            </w:tcMar>
+            <w:vAlign w:val="center"/>
+          </w:tcPr>
+          <w:p>
+            <w:pPr>
+              <w:spacing w:after="0" w:line="255"/>
+            </w:pPr>
+            <w:r>
+              <w:rPr>
+                <w:sz w:val="17"/>
+                <w:szCs w:val="17"/>
               </w:rPr>
               <w:t xml:space="preserve">Internacional. Sede en Ginebra, Suiza; fundada en 1947.</w:t>
             </w:r>
@@ -678,23 +889,24 @@
         </w:tc>
         <w:tc>
           <w:tcPr>
-            <w:tcW w:type="dxa" w:w="2480"/>
+            <w:tcW w:type="dxa" w:w="2400"/>
             <w:shd w:fill="EAF1F8" w:color="auto" w:val="clear"/>
             <w:tcMar>
-              <w:top w:type="dxa" w:w="45"/>
-              <w:left w:type="dxa" w:w="80"/>
-              <w:bottom w:type="dxa" w:w="45"/>
-              <w:right w:type="dxa" w:w="80"/>
-            </w:tcMar>
-          </w:tcPr>
-          <w:p>
-            <w:pPr>
-              <w:spacing w:after="0" w:line="240"/>
-            </w:pPr>
-            <w:r>
-              <w:rPr>
-                <w:sz w:val="16"/>
-                <w:szCs w:val="16"/>
+              <w:top w:type="dxa" w:w="75"/>
+              <w:left w:type="dxa" w:w="120"/>
+              <w:bottom w:type="dxa" w:w="75"/>
+              <w:right w:type="dxa" w:w="120"/>
+            </w:tcMar>
+            <w:vAlign w:val="center"/>
+          </w:tcPr>
+          <w:p>
+            <w:pPr>
+              <w:spacing w:after="0" w:line="255"/>
+            </w:pPr>
+            <w:r>
+              <w:rPr>
+                <w:sz w:val="17"/>
+                <w:szCs w:val="17"/>
               </w:rPr>
               <w:t xml:space="preserve">Crear normas internacionales por consenso para productos y documentación técnica, de modo que un plano sea válido en cualquier país.</w:t>
             </w:r>
@@ -702,76 +914,77 @@
         </w:tc>
         <w:tc>
           <w:tcPr>
-            <w:tcW w:type="dxa" w:w="2300"/>
+            <w:tcW w:type="dxa" w:w="2780"/>
             <w:shd w:fill="EAF1F8" w:color="auto" w:val="clear"/>
             <w:tcMar>
-              <w:top w:type="dxa" w:w="45"/>
-              <w:left w:type="dxa" w:w="80"/>
-              <w:bottom w:type="dxa" w:w="45"/>
-              <w:right w:type="dxa" w:w="80"/>
-            </w:tcMar>
-          </w:tcPr>
-          <w:p>
-            <w:pPr>
-              <w:spacing w:after="0" w:line="240"/>
-            </w:pPr>
-            <w:r>
-              <w:rPr>
-                <w:sz w:val="16"/>
-                <w:szCs w:val="16"/>
+              <w:top w:type="dxa" w:w="75"/>
+              <w:left w:type="dxa" w:w="120"/>
+              <w:bottom w:type="dxa" w:w="75"/>
+              <w:right w:type="dxa" w:w="120"/>
+            </w:tcMar>
+            <w:vAlign w:val="center"/>
+          </w:tcPr>
+          <w:p>
+            <w:pPr>
+              <w:spacing w:after="0" w:line="255"/>
+            </w:pPr>
+            <w:r>
+              <w:rPr>
+                <w:sz w:val="17"/>
+                <w:szCs w:val="17"/>
               </w:rPr>
               <w:t xml:space="preserve">ISO 128-1, principios generales de representación. </w:t>
             </w:r>
             <w:r>
               <w:rPr>
                 <w:color w:val="5B6575"/>
-                <w:sz w:val="13"/>
-                <w:szCs w:val="13"/>
+                <w:sz w:val="14"/>
+                <w:szCs w:val="14"/>
               </w:rPr>
               <w:t xml:space="preserve">[3]</w:t>
             </w:r>
             <w:r>
               <w:rPr>
-                <w:sz w:val="16"/>
-                <w:szCs w:val="16"/>
+                <w:sz w:val="17"/>
+                <w:szCs w:val="17"/>
               </w:rPr>
               <w:t xml:space="preserve"> ISO 129-1, acotación. </w:t>
             </w:r>
             <w:r>
               <w:rPr>
                 <w:color w:val="5B6575"/>
-                <w:sz w:val="13"/>
-                <w:szCs w:val="13"/>
+                <w:sz w:val="14"/>
+                <w:szCs w:val="14"/>
               </w:rPr>
               <w:t xml:space="preserve">[4]</w:t>
             </w:r>
             <w:r>
               <w:rPr>
-                <w:sz w:val="16"/>
-                <w:szCs w:val="16"/>
+                <w:sz w:val="17"/>
+                <w:szCs w:val="17"/>
               </w:rPr>
               <w:t xml:space="preserve"> ISO 1101, tolerancias geométricas. </w:t>
             </w:r>
             <w:r>
               <w:rPr>
                 <w:color w:val="5B6575"/>
-                <w:sz w:val="13"/>
-                <w:szCs w:val="13"/>
+                <w:sz w:val="14"/>
+                <w:szCs w:val="14"/>
               </w:rPr>
               <w:t xml:space="preserve">[5]</w:t>
             </w:r>
             <w:r>
               <w:rPr>
-                <w:sz w:val="16"/>
-                <w:szCs w:val="16"/>
+                <w:sz w:val="17"/>
+                <w:szCs w:val="17"/>
               </w:rPr>
               <w:t xml:space="preserve"> ISO 216, formatos de papel A0 a A4. </w:t>
             </w:r>
             <w:r>
               <w:rPr>
                 <w:color w:val="5B6575"/>
-                <w:sz w:val="13"/>
-                <w:szCs w:val="13"/>
+                <w:sz w:val="14"/>
+                <w:szCs w:val="14"/>
               </w:rPr>
               <w:t xml:space="preserve">[6]</w:t>
             </w:r>
@@ -786,147 +999,262 @@
           <w:tcPr>
             <w:tcW w:type="dxa" w:w="1150"/>
             <w:tcMar>
-              <w:top w:type="dxa" w:w="45"/>
-              <w:left w:type="dxa" w:w="80"/>
-              <w:bottom w:type="dxa" w:w="45"/>
-              <w:right w:type="dxa" w:w="80"/>
-            </w:tcMar>
-          </w:tcPr>
-          <w:p>
-            <w:pPr>
-              <w:spacing w:after="0" w:line="240"/>
+              <w:top w:type="dxa" w:w="75"/>
+              <w:left w:type="dxa" w:w="120"/>
+              <w:bottom w:type="dxa" w:w="75"/>
+              <w:right w:type="dxa" w:w="120"/>
+            </w:tcMar>
+            <w:vAlign w:val="center"/>
+          </w:tcPr>
+          <w:p>
+            <w:pPr>
+              <w:spacing w:after="0" w:line="255"/>
             </w:pPr>
             <w:r>
               <w:rPr>
                 <w:b/>
                 <w:bCs/>
+                <w:sz w:val="17"/>
+                <w:szCs w:val="17"/>
+              </w:rPr>
+              <w:t xml:space="preserve">ANSI</w:t>
+            </w:r>
+          </w:p>
+        </w:tc>
+        <w:tc>
+          <w:tcPr>
+            <w:tcW w:type="dxa" w:w="2000"/>
+            <w:tcMar>
+              <w:top w:type="dxa" w:w="75"/>
+              <w:left w:type="dxa" w:w="120"/>
+              <w:bottom w:type="dxa" w:w="75"/>
+              <w:right w:type="dxa" w:w="120"/>
+            </w:tcMar>
+            <w:vAlign w:val="center"/>
+          </w:tcPr>
+          <w:p>
+            <w:pPr>
+              <w:spacing w:after="0" w:line="255"/>
+            </w:pPr>
+            <w:r>
+              <w:rPr>
+                <w:sz w:val="17"/>
+                <w:szCs w:val="17"/>
+              </w:rPr>
+              <w:t xml:space="preserve">American National Standards Institute (Instituto Nacional Estadounidense de Estándares)</w:t>
+            </w:r>
+          </w:p>
+        </w:tc>
+        <w:tc>
+          <w:tcPr>
+            <w:tcW w:type="dxa" w:w="1750"/>
+            <w:tcMar>
+              <w:top w:type="dxa" w:w="75"/>
+              <w:left w:type="dxa" w:w="120"/>
+              <w:bottom w:type="dxa" w:w="75"/>
+              <w:right w:type="dxa" w:w="120"/>
+            </w:tcMar>
+            <w:vAlign w:val="center"/>
+          </w:tcPr>
+          <w:p>
+            <w:pPr>
+              <w:spacing w:after="0" w:line="255"/>
+            </w:pPr>
+            <w:r>
+              <w:rPr>
+                <w:sz w:val="17"/>
+                <w:szCs w:val="17"/>
+              </w:rPr>
+              <w:t xml:space="preserve">Estados Unidos. Organismo privado sin fines de lucro. </w:t>
+            </w:r>
+            <w:r>
+              <w:rPr>
+                <w:color w:val="5B6575"/>
+                <w:sz w:val="14"/>
+                <w:szCs w:val="14"/>
+              </w:rPr>
+              <w:t xml:space="preserve">[7]</w:t>
+            </w:r>
+          </w:p>
+        </w:tc>
+        <w:tc>
+          <w:tcPr>
+            <w:tcW w:type="dxa" w:w="2400"/>
+            <w:tcMar>
+              <w:top w:type="dxa" w:w="75"/>
+              <w:left w:type="dxa" w:w="120"/>
+              <w:bottom w:type="dxa" w:w="75"/>
+              <w:right w:type="dxa" w:w="120"/>
+            </w:tcMar>
+            <w:vAlign w:val="center"/>
+          </w:tcPr>
+          <w:p>
+            <w:pPr>
+              <w:spacing w:after="0" w:line="255"/>
+            </w:pPr>
+            <w:r>
+              <w:rPr>
+                <w:sz w:val="17"/>
+                <w:szCs w:val="17"/>
+              </w:rPr>
+              <w:t xml:space="preserve">Aprobar como normas nacionales los estándares que desarrollan otros organismos. En dibujo, aprueba las normas Y14 que desarrolla ASME.</w:t>
+            </w:r>
+          </w:p>
+        </w:tc>
+        <w:tc>
+          <w:tcPr>
+            <w:tcW w:type="dxa" w:w="2780"/>
+            <w:tcMar>
+              <w:top w:type="dxa" w:w="75"/>
+              <w:left w:type="dxa" w:w="120"/>
+              <w:bottom w:type="dxa" w:w="75"/>
+              <w:right w:type="dxa" w:w="120"/>
+            </w:tcMar>
+            <w:vAlign w:val="center"/>
+          </w:tcPr>
+          <w:p>
+            <w:pPr>
+              <w:spacing w:after="0" w:line="255"/>
+            </w:pPr>
+            <w:r>
+              <w:rPr>
+                <w:sz w:val="17"/>
+                <w:szCs w:val="17"/>
+              </w:rPr>
+              <w:t xml:space="preserve">ASME Y14.5-2018, dimensionamiento y tolerancias GD&amp;T. </w:t>
+            </w:r>
+            <w:r>
+              <w:rPr>
+                <w:color w:val="5B6575"/>
+                <w:sz w:val="14"/>
+                <w:szCs w:val="14"/>
+              </w:rPr>
+              <w:t xml:space="preserve">[8]</w:t>
+            </w:r>
+            <w:r>
+              <w:rPr>
+                <w:sz w:val="17"/>
+                <w:szCs w:val="17"/>
+              </w:rPr>
+              <w:t xml:space="preserve"> ASME Y14.3, vistas ortográficas y pictóricas. </w:t>
+            </w:r>
+            <w:r>
+              <w:rPr>
+                <w:color w:val="5B6575"/>
+                <w:sz w:val="14"/>
+                <w:szCs w:val="14"/>
+              </w:rPr>
+              <w:t xml:space="preserve">[9]</w:t>
+            </w:r>
+          </w:p>
+        </w:tc>
+      </w:tr>
+    </w:tbl>
+    <w:p>
+      <w:pPr>
+        <w:pStyle w:val="Heading2"/>
+      </w:pPr>
+      <w:r>
+        <w:t xml:space="preserve">3. Diferencia principal entre ISO y ANSI</w:t>
+      </w:r>
+    </w:p>
+    <w:tbl>
+      <w:tblPr>
+        <w:tblW w:type="dxa" w:w="10080"/>
+        <w:tblBorders>
+          <w:top w:val="none" w:color="FFFFFF" w:sz="0"/>
+          <w:left w:val="single" w:color="1F4E79" w:sz="24"/>
+          <w:bottom w:val="none" w:color="FFFFFF" w:sz="0"/>
+          <w:right w:val="none" w:color="FFFFFF" w:sz="0"/>
+          <w:insideH w:val="none" w:color="FFFFFF" w:sz="0"/>
+          <w:insideV w:val="none" w:color="FFFFFF" w:sz="0"/>
+        </w:tblBorders>
+        <w:tblLayout w:type="fixed"/>
+      </w:tblPr>
+      <w:tblGrid>
+        <w:gridCol w:w="10080"/>
+      </w:tblGrid>
+      <w:tr>
+        <w:trPr>
+          <w:cantSplit/>
+        </w:trPr>
+        <w:tc>
+          <w:tcPr>
+            <w:tcW w:type="dxa" w:w="10080"/>
+            <w:shd w:fill="EAF1F8" w:color="auto" w:val="clear"/>
+            <w:tcMar>
+              <w:top w:type="dxa" w:w="130"/>
+              <w:left w:type="dxa" w:w="220"/>
+              <w:bottom w:type="dxa" w:w="130"/>
+              <w:right w:type="dxa" w:w="220"/>
+            </w:tcMar>
+          </w:tcPr>
+          <w:p>
+            <w:pPr>
+              <w:spacing w:after="0" w:line="276"/>
+            </w:pPr>
+            <w:r>
+              <w:rPr>
+                <w:b/>
+                <w:bCs/>
+                <w:sz w:val="19"/>
+                <w:szCs w:val="19"/>
+              </w:rPr>
+              <w:t xml:space="preserve">Método de proyección.</w:t>
+            </w:r>
+            <w:r>
+              <w:rPr>
+                <w:sz w:val="19"/>
+                <w:szCs w:val="19"/>
+              </w:rPr>
+              <w:t xml:space="preserve"> ISO usa el </w:t>
+            </w:r>
+            <w:r>
+              <w:rPr>
+                <w:b/>
+                <w:bCs/>
+                <w:sz w:val="19"/>
+                <w:szCs w:val="19"/>
+              </w:rPr>
+              <w:t xml:space="preserve">primer diedro</w:t>
+            </w:r>
+            <w:r>
+              <w:rPr>
+                <w:sz w:val="19"/>
+                <w:szCs w:val="19"/>
+              </w:rPr>
+              <w:t xml:space="preserve">: la vista superior queda debajo de la vista frontal. ANSI/ASME usa el </w:t>
+            </w:r>
+            <w:r>
+              <w:rPr>
+                <w:b/>
+                <w:bCs/>
+                <w:sz w:val="19"/>
+                <w:szCs w:val="19"/>
+              </w:rPr>
+              <w:t xml:space="preserve">tercer diedro</w:t>
+            </w:r>
+            <w:r>
+              <w:rPr>
+                <w:sz w:val="19"/>
+                <w:szCs w:val="19"/>
+              </w:rPr>
+              <w:t xml:space="preserve">: la vista superior queda encima de la frontal. </w:t>
+            </w:r>
+            <w:r>
+              <w:rPr>
+                <w:color w:val="5B6575"/>
                 <w:sz w:val="16"/>
                 <w:szCs w:val="16"/>
               </w:rPr>
-              <w:t xml:space="preserve">ANSI</w:t>
-            </w:r>
-          </w:p>
-        </w:tc>
-        <w:tc>
-          <w:tcPr>
-            <w:tcW w:type="dxa" w:w="2150"/>
-            <w:tcMar>
-              <w:top w:type="dxa" w:w="45"/>
-              <w:left w:type="dxa" w:w="80"/>
-              <w:bottom w:type="dxa" w:w="45"/>
-              <w:right w:type="dxa" w:w="80"/>
-            </w:tcMar>
-          </w:tcPr>
-          <w:p>
-            <w:pPr>
-              <w:spacing w:after="0" w:line="240"/>
-            </w:pPr>
-            <w:r>
-              <w:rPr>
-                <w:sz w:val="16"/>
-                <w:szCs w:val="16"/>
-              </w:rPr>
-              <w:t xml:space="preserve">American National Standards Institute (Instituto Nacional Estadounidense de Estándares)</w:t>
-            </w:r>
-          </w:p>
-        </w:tc>
-        <w:tc>
-          <w:tcPr>
-            <w:tcW w:type="dxa" w:w="2000"/>
-            <w:tcMar>
-              <w:top w:type="dxa" w:w="45"/>
-              <w:left w:type="dxa" w:w="80"/>
-              <w:bottom w:type="dxa" w:w="45"/>
-              <w:right w:type="dxa" w:w="80"/>
-            </w:tcMar>
-          </w:tcPr>
-          <w:p>
-            <w:pPr>
-              <w:spacing w:after="0" w:line="240"/>
-            </w:pPr>
-            <w:r>
-              <w:rPr>
-                <w:sz w:val="16"/>
-                <w:szCs w:val="16"/>
-              </w:rPr>
-              <w:t xml:space="preserve">Estados Unidos. Organismo privado sin fines de lucro. </w:t>
-            </w:r>
-            <w:r>
-              <w:rPr>
-                <w:color w:val="5B6575"/>
-                <w:sz w:val="13"/>
-                <w:szCs w:val="13"/>
-              </w:rPr>
-              <w:t xml:space="preserve">[7]</w:t>
-            </w:r>
-          </w:p>
-        </w:tc>
-        <w:tc>
-          <w:tcPr>
-            <w:tcW w:type="dxa" w:w="2480"/>
-            <w:tcMar>
-              <w:top w:type="dxa" w:w="45"/>
-              <w:left w:type="dxa" w:w="80"/>
-              <w:bottom w:type="dxa" w:w="45"/>
-              <w:right w:type="dxa" w:w="80"/>
-            </w:tcMar>
-          </w:tcPr>
-          <w:p>
-            <w:pPr>
-              <w:spacing w:after="0" w:line="240"/>
-            </w:pPr>
-            <w:r>
-              <w:rPr>
-                <w:sz w:val="16"/>
-                <w:szCs w:val="16"/>
-              </w:rPr>
-              <w:t xml:space="preserve">Aprobar como normas nacionales los estándares que desarrollan otros organismos. En dibujo, aprueba las normas Y14 que desarrolla ASME.</w:t>
-            </w:r>
-          </w:p>
-        </w:tc>
-        <w:tc>
-          <w:tcPr>
-            <w:tcW w:type="dxa" w:w="2300"/>
-            <w:tcMar>
-              <w:top w:type="dxa" w:w="45"/>
-              <w:left w:type="dxa" w:w="80"/>
-              <w:bottom w:type="dxa" w:w="45"/>
-              <w:right w:type="dxa" w:w="80"/>
-            </w:tcMar>
-          </w:tcPr>
-          <w:p>
-            <w:pPr>
-              <w:spacing w:after="0" w:line="240"/>
-            </w:pPr>
-            <w:r>
-              <w:rPr>
-                <w:sz w:val="16"/>
-                <w:szCs w:val="16"/>
-              </w:rPr>
-              <w:t xml:space="preserve">ASME Y14.5-2018, dimensionamiento y tolerancias GD&amp;T. </w:t>
-            </w:r>
-            <w:r>
-              <w:rPr>
-                <w:color w:val="5B6575"/>
-                <w:sz w:val="13"/>
-                <w:szCs w:val="13"/>
-              </w:rPr>
-              <w:t xml:space="preserve">[8]</w:t>
-            </w:r>
-            <w:r>
-              <w:rPr>
-                <w:sz w:val="16"/>
-                <w:szCs w:val="16"/>
-              </w:rPr>
-              <w:t xml:space="preserve"> ASME Y14.3, vistas ortográficas y pictóricas. </w:t>
-            </w:r>
-            <w:r>
-              <w:rPr>
-                <w:color w:val="5B6575"/>
-                <w:sz w:val="13"/>
-                <w:szCs w:val="13"/>
-              </w:rPr>
-              <w:t xml:space="preserve">[9]</w:t>
+              <w:t xml:space="preserve">[10][11]</w:t>
+            </w:r>
+            <w:r>
+              <w:rPr>
+                <w:sz w:val="19"/>
+                <w:szCs w:val="19"/>
+              </w:rPr>
+              <w:t xml:space="preserve"> Confundir ambos métodos invierte la posición de las vistas y puede llevar a fabricar la pieza de forma incorrecta, por eso conviene identificar el método antes de leer el plano.</w:t>
             </w:r>
           </w:p>
         </w:tc>
@@ -934,89 +1262,8 @@
     </w:tbl>
     <w:p>
       <w:pPr>
-        <w:spacing w:after="60"/>
-      </w:pPr>
-    </w:p>
-    <w:p>
-      <w:pPr>
-        <w:pStyle w:val="Heading2"/>
-      </w:pPr>
-      <w:r>
-        <w:t xml:space="preserve">3. Diferencia principal entre ISO y ANSI</w:t>
-      </w:r>
-    </w:p>
-    <w:p>
-      <w:pPr>
-        <w:pBdr>
-          <w:left w:val="single" w:color="1F4E79" w:sz="18" w:space="8"/>
-        </w:pBdr>
-        <w:shd w:fill="EAF1F8" w:color="auto" w:val="clear"/>
-        <w:spacing w:after="120" w:before="80" w:line="264"/>
-        <w:ind w:left="160" w:right="160"/>
-      </w:pPr>
-      <w:r>
-        <w:rPr>
-          <w:b/>
-          <w:bCs/>
-          <w:sz w:val="19"/>
-          <w:szCs w:val="19"/>
-        </w:rPr>
-        <w:t xml:space="preserve">Método de proyección.</w:t>
-      </w:r>
-      <w:r>
-        <w:rPr>
-          <w:sz w:val="19"/>
-          <w:szCs w:val="19"/>
-        </w:rPr>
-        <w:t xml:space="preserve"> ISO usa el </w:t>
-      </w:r>
-      <w:r>
-        <w:rPr>
-          <w:b/>
-          <w:bCs/>
-          <w:sz w:val="19"/>
-          <w:szCs w:val="19"/>
-        </w:rPr>
-        <w:t xml:space="preserve">primer diedro</w:t>
-      </w:r>
-      <w:r>
-        <w:rPr>
-          <w:sz w:val="19"/>
-          <w:szCs w:val="19"/>
-        </w:rPr>
-        <w:t xml:space="preserve">: la vista superior queda debajo de la vista frontal. ANSI/ASME usa el </w:t>
-      </w:r>
-      <w:r>
-        <w:rPr>
-          <w:b/>
-          <w:bCs/>
-          <w:sz w:val="19"/>
-          <w:szCs w:val="19"/>
-        </w:rPr>
-        <w:t xml:space="preserve">tercer diedro</w:t>
-      </w:r>
-      <w:r>
-        <w:rPr>
-          <w:sz w:val="19"/>
-          <w:szCs w:val="19"/>
-        </w:rPr>
-        <w:t xml:space="preserve">: la vista superior queda encima de la frontal. </w:t>
-      </w:r>
-      <w:r>
-        <w:rPr>
-          <w:color w:val="5B6575"/>
-          <w:sz w:val="16"/>
-          <w:szCs w:val="16"/>
-        </w:rPr>
-        <w:t xml:space="preserve">[10][11]</w:t>
-      </w:r>
-      <w:r>
-        <w:rPr>
-          <w:sz w:val="19"/>
-          <w:szCs w:val="19"/>
-        </w:rPr>
-        <w:t xml:space="preserve"> Confundir ambos métodos invierte la posición de las vistas y puede llevar a fabricar la pieza de forma incorrecta, por eso conviene identificar el método antes de leer el plano.</w:t>
-      </w:r>
+        <w:spacing w:after="120"/>
+      </w:pPr>
     </w:p>
     <w:tbl>
       <w:tblPr>
@@ -1045,23 +1292,24 @@
             <w:tcW w:type="dxa" w:w="2600"/>
             <w:shd w:fill="1F4E79" w:color="auto" w:val="clear"/>
             <w:tcMar>
-              <w:top w:type="dxa" w:w="45"/>
-              <w:left w:type="dxa" w:w="80"/>
-              <w:bottom w:type="dxa" w:w="45"/>
-              <w:right w:type="dxa" w:w="80"/>
-            </w:tcMar>
-          </w:tcPr>
-          <w:p>
-            <w:pPr>
-              <w:spacing w:after="0" w:line="240"/>
+              <w:top w:type="dxa" w:w="75"/>
+              <w:left w:type="dxa" w:w="120"/>
+              <w:bottom w:type="dxa" w:w="75"/>
+              <w:right w:type="dxa" w:w="120"/>
+            </w:tcMar>
+            <w:vAlign w:val="center"/>
+          </w:tcPr>
+          <w:p>
+            <w:pPr>
+              <w:spacing w:after="0" w:line="255"/>
             </w:pPr>
             <w:r>
               <w:rPr>
                 <w:b/>
                 <w:bCs/>
                 <w:color w:val="FFFFFF"/>
-                <w:sz w:val="16"/>
-                <w:szCs w:val="16"/>
+                <w:sz w:val="17"/>
+                <w:szCs w:val="17"/>
               </w:rPr>
               <w:t xml:space="preserve">Aspecto</w:t>
             </w:r>
@@ -1072,23 +1320,24 @@
             <w:tcW w:type="dxa" w:w="3740"/>
             <w:shd w:fill="1F4E79" w:color="auto" w:val="clear"/>
             <w:tcMar>
-              <w:top w:type="dxa" w:w="45"/>
-              <w:left w:type="dxa" w:w="80"/>
-              <w:bottom w:type="dxa" w:w="45"/>
-              <w:right w:type="dxa" w:w="80"/>
-            </w:tcMar>
-          </w:tcPr>
-          <w:p>
-            <w:pPr>
-              <w:spacing w:after="0" w:line="240"/>
+              <w:top w:type="dxa" w:w="75"/>
+              <w:left w:type="dxa" w:w="120"/>
+              <w:bottom w:type="dxa" w:w="75"/>
+              <w:right w:type="dxa" w:w="120"/>
+            </w:tcMar>
+            <w:vAlign w:val="center"/>
+          </w:tcPr>
+          <w:p>
+            <w:pPr>
+              <w:spacing w:after="0" w:line="255"/>
             </w:pPr>
             <w:r>
               <w:rPr>
                 <w:b/>
                 <w:bCs/>
                 <w:color w:val="FFFFFF"/>
-                <w:sz w:val="16"/>
-                <w:szCs w:val="16"/>
+                <w:sz w:val="17"/>
+                <w:szCs w:val="17"/>
               </w:rPr>
               <w:t xml:space="preserve">ISO</w:t>
             </w:r>
@@ -1099,23 +1348,24 @@
             <w:tcW w:type="dxa" w:w="3740"/>
             <w:shd w:fill="1F4E79" w:color="auto" w:val="clear"/>
             <w:tcMar>
-              <w:top w:type="dxa" w:w="45"/>
-              <w:left w:type="dxa" w:w="80"/>
-              <w:bottom w:type="dxa" w:w="45"/>
-              <w:right w:type="dxa" w:w="80"/>
-            </w:tcMar>
-          </w:tcPr>
-          <w:p>
-            <w:pPr>
-              <w:spacing w:after="0" w:line="240"/>
+              <w:top w:type="dxa" w:w="75"/>
+              <w:left w:type="dxa" w:w="120"/>
+              <w:bottom w:type="dxa" w:w="75"/>
+              <w:right w:type="dxa" w:w="120"/>
+            </w:tcMar>
+            <w:vAlign w:val="center"/>
+          </w:tcPr>
+          <w:p>
+            <w:pPr>
+              <w:spacing w:after="0" w:line="255"/>
             </w:pPr>
             <w:r>
               <w:rPr>
                 <w:b/>
                 <w:bCs/>
                 <w:color w:val="FFFFFF"/>
-                <w:sz w:val="16"/>
-                <w:szCs w:val="16"/>
+                <w:sz w:val="17"/>
+                <w:szCs w:val="17"/>
               </w:rPr>
               <w:t xml:space="preserve">ANSI / ASME</w:t>
             </w:r>
@@ -1130,22 +1380,23 @@
           <w:tcPr>
             <w:tcW w:type="dxa" w:w="2600"/>
             <w:tcMar>
-              <w:top w:type="dxa" w:w="45"/>
-              <w:left w:type="dxa" w:w="80"/>
-              <w:bottom w:type="dxa" w:w="45"/>
-              <w:right w:type="dxa" w:w="80"/>
-            </w:tcMar>
-          </w:tcPr>
-          <w:p>
-            <w:pPr>
-              <w:spacing w:after="0" w:line="240"/>
+              <w:top w:type="dxa" w:w="75"/>
+              <w:left w:type="dxa" w:w="120"/>
+              <w:bottom w:type="dxa" w:w="75"/>
+              <w:right w:type="dxa" w:w="120"/>
+            </w:tcMar>
+            <w:vAlign w:val="center"/>
+          </w:tcPr>
+          <w:p>
+            <w:pPr>
+              <w:spacing w:after="0" w:line="255"/>
             </w:pPr>
             <w:r>
               <w:rPr>
                 <w:b/>
                 <w:bCs/>
-                <w:sz w:val="16"/>
-                <w:szCs w:val="16"/>
+                <w:sz w:val="17"/>
+                <w:szCs w:val="17"/>
               </w:rPr>
               <w:t xml:space="preserve">Ámbito</w:t>
             </w:r>
@@ -1155,20 +1406,21 @@
           <w:tcPr>
             <w:tcW w:type="dxa" w:w="3740"/>
             <w:tcMar>
-              <w:top w:type="dxa" w:w="45"/>
-              <w:left w:type="dxa" w:w="80"/>
-              <w:bottom w:type="dxa" w:w="45"/>
-              <w:right w:type="dxa" w:w="80"/>
-            </w:tcMar>
-          </w:tcPr>
-          <w:p>
-            <w:pPr>
-              <w:spacing w:after="0" w:line="240"/>
-            </w:pPr>
-            <w:r>
-              <w:rPr>
-                <w:sz w:val="16"/>
-                <w:szCs w:val="16"/>
+              <w:top w:type="dxa" w:w="75"/>
+              <w:left w:type="dxa" w:w="120"/>
+              <w:bottom w:type="dxa" w:w="75"/>
+              <w:right w:type="dxa" w:w="120"/>
+            </w:tcMar>
+            <w:vAlign w:val="center"/>
+          </w:tcPr>
+          <w:p>
+            <w:pPr>
+              <w:spacing w:after="0" w:line="255"/>
+            </w:pPr>
+            <w:r>
+              <w:rPr>
+                <w:sz w:val="17"/>
+                <w:szCs w:val="17"/>
               </w:rPr>
               <w:t xml:space="preserve">Internacional, sede en Ginebra</w:t>
             </w:r>
@@ -1178,20 +1430,21 @@
           <w:tcPr>
             <w:tcW w:type="dxa" w:w="3740"/>
             <w:tcMar>
-              <w:top w:type="dxa" w:w="45"/>
-              <w:left w:type="dxa" w:w="80"/>
-              <w:bottom w:type="dxa" w:w="45"/>
-              <w:right w:type="dxa" w:w="80"/>
-            </w:tcMar>
-          </w:tcPr>
-          <w:p>
-            <w:pPr>
-              <w:spacing w:after="0" w:line="240"/>
-            </w:pPr>
-            <w:r>
-              <w:rPr>
-                <w:sz w:val="16"/>
-                <w:szCs w:val="16"/>
+              <w:top w:type="dxa" w:w="75"/>
+              <w:left w:type="dxa" w:w="120"/>
+              <w:bottom w:type="dxa" w:w="75"/>
+              <w:right w:type="dxa" w:w="120"/>
+            </w:tcMar>
+            <w:vAlign w:val="center"/>
+          </w:tcPr>
+          <w:p>
+            <w:pPr>
+              <w:spacing w:after="0" w:line="255"/>
+            </w:pPr>
+            <w:r>
+              <w:rPr>
+                <w:sz w:val="17"/>
+                <w:szCs w:val="17"/>
               </w:rPr>
               <w:t xml:space="preserve">Estados Unidos; las Y14 las desarrolla ASME</w:t>
             </w:r>
@@ -1207,22 +1460,23 @@
             <w:tcW w:type="dxa" w:w="2600"/>
             <w:shd w:fill="EAF1F8" w:color="auto" w:val="clear"/>
             <w:tcMar>
-              <w:top w:type="dxa" w:w="45"/>
-              <w:left w:type="dxa" w:w="80"/>
-              <w:bottom w:type="dxa" w:w="45"/>
-              <w:right w:type="dxa" w:w="80"/>
-            </w:tcMar>
-          </w:tcPr>
-          <w:p>
-            <w:pPr>
-              <w:spacing w:after="0" w:line="240"/>
+              <w:top w:type="dxa" w:w="75"/>
+              <w:left w:type="dxa" w:w="120"/>
+              <w:bottom w:type="dxa" w:w="75"/>
+              <w:right w:type="dxa" w:w="120"/>
+            </w:tcMar>
+            <w:vAlign w:val="center"/>
+          </w:tcPr>
+          <w:p>
+            <w:pPr>
+              <w:spacing w:after="0" w:line="255"/>
             </w:pPr>
             <w:r>
               <w:rPr>
                 <w:b/>
                 <w:bCs/>
-                <w:sz w:val="16"/>
-                <w:szCs w:val="16"/>
+                <w:sz w:val="17"/>
+                <w:szCs w:val="17"/>
               </w:rPr>
               <w:t xml:space="preserve">Unidades habituales</w:t>
             </w:r>
@@ -1233,20 +1487,21 @@
             <w:tcW w:type="dxa" w:w="3740"/>
             <w:shd w:fill="EAF1F8" w:color="auto" w:val="clear"/>
             <w:tcMar>
-              <w:top w:type="dxa" w:w="45"/>
-              <w:left w:type="dxa" w:w="80"/>
-              <w:bottom w:type="dxa" w:w="45"/>
-              <w:right w:type="dxa" w:w="80"/>
-            </w:tcMar>
-          </w:tcPr>
-          <w:p>
-            <w:pPr>
-              <w:spacing w:after="0" w:line="240"/>
-            </w:pPr>
-            <w:r>
-              <w:rPr>
-                <w:sz w:val="16"/>
-                <w:szCs w:val="16"/>
+              <w:top w:type="dxa" w:w="75"/>
+              <w:left w:type="dxa" w:w="120"/>
+              <w:bottom w:type="dxa" w:w="75"/>
+              <w:right w:type="dxa" w:w="120"/>
+            </w:tcMar>
+            <w:vAlign w:val="center"/>
+          </w:tcPr>
+          <w:p>
+            <w:pPr>
+              <w:spacing w:after="0" w:line="255"/>
+            </w:pPr>
+            <w:r>
+              <w:rPr>
+                <w:sz w:val="17"/>
+                <w:szCs w:val="17"/>
               </w:rPr>
               <w:t xml:space="preserve">Milímetros (mm)</w:t>
             </w:r>
@@ -1257,20 +1512,21 @@
             <w:tcW w:type="dxa" w:w="3740"/>
             <w:shd w:fill="EAF1F8" w:color="auto" w:val="clear"/>
             <w:tcMar>
-              <w:top w:type="dxa" w:w="45"/>
-              <w:left w:type="dxa" w:w="80"/>
-              <w:bottom w:type="dxa" w:w="45"/>
-              <w:right w:type="dxa" w:w="80"/>
-            </w:tcMar>
-          </w:tcPr>
-          <w:p>
-            <w:pPr>
-              <w:spacing w:after="0" w:line="240"/>
-            </w:pPr>
-            <w:r>
-              <w:rPr>
-                <w:sz w:val="16"/>
-                <w:szCs w:val="16"/>
+              <w:top w:type="dxa" w:w="75"/>
+              <w:left w:type="dxa" w:w="120"/>
+              <w:bottom w:type="dxa" w:w="75"/>
+              <w:right w:type="dxa" w:w="120"/>
+            </w:tcMar>
+            <w:vAlign w:val="center"/>
+          </w:tcPr>
+          <w:p>
+            <w:pPr>
+              <w:spacing w:after="0" w:line="255"/>
+            </w:pPr>
+            <w:r>
+              <w:rPr>
+                <w:sz w:val="17"/>
+                <w:szCs w:val="17"/>
               </w:rPr>
               <w:t xml:space="preserve">Pulgadas (in)</w:t>
             </w:r>
@@ -1285,22 +1541,23 @@
           <w:tcPr>
             <w:tcW w:type="dxa" w:w="2600"/>
             <w:tcMar>
-              <w:top w:type="dxa" w:w="45"/>
-              <w:left w:type="dxa" w:w="80"/>
-              <w:bottom w:type="dxa" w:w="45"/>
-              <w:right w:type="dxa" w:w="80"/>
-            </w:tcMar>
-          </w:tcPr>
-          <w:p>
-            <w:pPr>
-              <w:spacing w:after="0" w:line="240"/>
+              <w:top w:type="dxa" w:w="75"/>
+              <w:left w:type="dxa" w:w="120"/>
+              <w:bottom w:type="dxa" w:w="75"/>
+              <w:right w:type="dxa" w:w="120"/>
+            </w:tcMar>
+            <w:vAlign w:val="center"/>
+          </w:tcPr>
+          <w:p>
+            <w:pPr>
+              <w:spacing w:after="0" w:line="255"/>
             </w:pPr>
             <w:r>
               <w:rPr>
                 <w:b/>
                 <w:bCs/>
-                <w:sz w:val="16"/>
-                <w:szCs w:val="16"/>
+                <w:sz w:val="17"/>
+                <w:szCs w:val="17"/>
               </w:rPr>
               <w:t xml:space="preserve">Método de proyección</w:t>
             </w:r>
@@ -1310,20 +1567,21 @@
           <w:tcPr>
             <w:tcW w:type="dxa" w:w="3740"/>
             <w:tcMar>
-              <w:top w:type="dxa" w:w="45"/>
-              <w:left w:type="dxa" w:w="80"/>
-              <w:bottom w:type="dxa" w:w="45"/>
-              <w:right w:type="dxa" w:w="80"/>
-            </w:tcMar>
-          </w:tcPr>
-          <w:p>
-            <w:pPr>
-              <w:spacing w:after="0" w:line="240"/>
-            </w:pPr>
-            <w:r>
-              <w:rPr>
-                <w:sz w:val="16"/>
-                <w:szCs w:val="16"/>
+              <w:top w:type="dxa" w:w="75"/>
+              <w:left w:type="dxa" w:w="120"/>
+              <w:bottom w:type="dxa" w:w="75"/>
+              <w:right w:type="dxa" w:w="120"/>
+            </w:tcMar>
+            <w:vAlign w:val="center"/>
+          </w:tcPr>
+          <w:p>
+            <w:pPr>
+              <w:spacing w:after="0" w:line="255"/>
+            </w:pPr>
+            <w:r>
+              <w:rPr>
+                <w:sz w:val="17"/>
+                <w:szCs w:val="17"/>
               </w:rPr>
               <w:t xml:space="preserve">Primer diedro</w:t>
             </w:r>
@@ -1333,20 +1591,21 @@
           <w:tcPr>
             <w:tcW w:type="dxa" w:w="3740"/>
             <w:tcMar>
-              <w:top w:type="dxa" w:w="45"/>
-              <w:left w:type="dxa" w:w="80"/>
-              <w:bottom w:type="dxa" w:w="45"/>
-              <w:right w:type="dxa" w:w="80"/>
-            </w:tcMar>
-          </w:tcPr>
-          <w:p>
-            <w:pPr>
-              <w:spacing w:after="0" w:line="240"/>
-            </w:pPr>
-            <w:r>
-              <w:rPr>
-                <w:sz w:val="16"/>
-                <w:szCs w:val="16"/>
+              <w:top w:type="dxa" w:w="75"/>
+              <w:left w:type="dxa" w:w="120"/>
+              <w:bottom w:type="dxa" w:w="75"/>
+              <w:right w:type="dxa" w:w="120"/>
+            </w:tcMar>
+            <w:vAlign w:val="center"/>
+          </w:tcPr>
+          <w:p>
+            <w:pPr>
+              <w:spacing w:after="0" w:line="255"/>
+            </w:pPr>
+            <w:r>
+              <w:rPr>
+                <w:sz w:val="17"/>
+                <w:szCs w:val="17"/>
               </w:rPr>
               <w:t xml:space="preserve">Tercer diedro</w:t>
             </w:r>
@@ -1362,22 +1621,23 @@
             <w:tcW w:type="dxa" w:w="2600"/>
             <w:shd w:fill="EAF1F8" w:color="auto" w:val="clear"/>
             <w:tcMar>
-              <w:top w:type="dxa" w:w="45"/>
-              <w:left w:type="dxa" w:w="80"/>
-              <w:bottom w:type="dxa" w:w="45"/>
-              <w:right w:type="dxa" w:w="80"/>
-            </w:tcMar>
-          </w:tcPr>
-          <w:p>
-            <w:pPr>
-              <w:spacing w:after="0" w:line="240"/>
+              <w:top w:type="dxa" w:w="75"/>
+              <w:left w:type="dxa" w:w="120"/>
+              <w:bottom w:type="dxa" w:w="75"/>
+              <w:right w:type="dxa" w:w="120"/>
+            </w:tcMar>
+            <w:vAlign w:val="center"/>
+          </w:tcPr>
+          <w:p>
+            <w:pPr>
+              <w:spacing w:after="0" w:line="255"/>
             </w:pPr>
             <w:r>
               <w:rPr>
                 <w:b/>
                 <w:bCs/>
-                <w:sz w:val="16"/>
-                <w:szCs w:val="16"/>
+                <w:sz w:val="17"/>
+                <w:szCs w:val="17"/>
               </w:rPr>
               <w:t xml:space="preserve">Tolerancias geométricas por defecto</w:t>
             </w:r>
@@ -1388,28 +1648,29 @@
             <w:tcW w:type="dxa" w:w="3740"/>
             <w:shd w:fill="EAF1F8" w:color="auto" w:val="clear"/>
             <w:tcMar>
-              <w:top w:type="dxa" w:w="45"/>
-              <w:left w:type="dxa" w:w="80"/>
-              <w:bottom w:type="dxa" w:w="45"/>
-              <w:right w:type="dxa" w:w="80"/>
-            </w:tcMar>
-          </w:tcPr>
-          <w:p>
-            <w:pPr>
-              <w:spacing w:after="0" w:line="240"/>
-            </w:pPr>
-            <w:r>
-              <w:rPr>
-                <w:sz w:val="16"/>
-                <w:szCs w:val="16"/>
+              <w:top w:type="dxa" w:w="75"/>
+              <w:left w:type="dxa" w:w="120"/>
+              <w:bottom w:type="dxa" w:w="75"/>
+              <w:right w:type="dxa" w:w="120"/>
+            </w:tcMar>
+            <w:vAlign w:val="center"/>
+          </w:tcPr>
+          <w:p>
+            <w:pPr>
+              <w:spacing w:after="0" w:line="255"/>
+            </w:pPr>
+            <w:r>
+              <w:rPr>
+                <w:sz w:val="17"/>
+                <w:szCs w:val="17"/>
               </w:rPr>
               <w:t xml:space="preserve">Independencia: cada requisito se verifica por separado (ISO 8015). </w:t>
             </w:r>
             <w:r>
               <w:rPr>
                 <w:color w:val="5B6575"/>
-                <w:sz w:val="13"/>
-                <w:szCs w:val="13"/>
+                <w:sz w:val="14"/>
+                <w:szCs w:val="14"/>
               </w:rPr>
               <w:t xml:space="preserve">[12]</w:t>
             </w:r>
@@ -1420,28 +1681,29 @@
             <w:tcW w:type="dxa" w:w="3740"/>
             <w:shd w:fill="EAF1F8" w:color="auto" w:val="clear"/>
             <w:tcMar>
-              <w:top w:type="dxa" w:w="45"/>
-              <w:left w:type="dxa" w:w="80"/>
-              <w:bottom w:type="dxa" w:w="45"/>
-              <w:right w:type="dxa" w:w="80"/>
-            </w:tcMar>
-          </w:tcPr>
-          <w:p>
-            <w:pPr>
-              <w:spacing w:after="0" w:line="240"/>
-            </w:pPr>
-            <w:r>
-              <w:rPr>
-                <w:sz w:val="16"/>
-                <w:szCs w:val="16"/>
+              <w:top w:type="dxa" w:w="75"/>
+              <w:left w:type="dxa" w:w="120"/>
+              <w:bottom w:type="dxa" w:w="75"/>
+              <w:right w:type="dxa" w:w="120"/>
+            </w:tcMar>
+            <w:vAlign w:val="center"/>
+          </w:tcPr>
+          <w:p>
+            <w:pPr>
+              <w:spacing w:after="0" w:line="255"/>
+            </w:pPr>
+            <w:r>
+              <w:rPr>
+                <w:sz w:val="17"/>
+                <w:szCs w:val="17"/>
               </w:rPr>
               <w:t xml:space="preserve">Regla #1 (envolvente) para elementos de tamaño (Y14.5-2018). </w:t>
             </w:r>
             <w:r>
               <w:rPr>
                 <w:color w:val="5B6575"/>
-                <w:sz w:val="13"/>
-                <w:szCs w:val="13"/>
+                <w:sz w:val="14"/>
+                <w:szCs w:val="14"/>
               </w:rPr>
               <w:t xml:space="preserve">[8]</w:t>
             </w:r>
@@ -1456,22 +1718,23 @@
           <w:tcPr>
             <w:tcW w:type="dxa" w:w="2600"/>
             <w:tcMar>
-              <w:top w:type="dxa" w:w="45"/>
-              <w:left w:type="dxa" w:w="80"/>
-              <w:bottom w:type="dxa" w:w="45"/>
-              <w:right w:type="dxa" w:w="80"/>
-            </w:tcMar>
-          </w:tcPr>
-          <w:p>
-            <w:pPr>
-              <w:spacing w:after="0" w:line="240"/>
+              <w:top w:type="dxa" w:w="75"/>
+              <w:left w:type="dxa" w:w="120"/>
+              <w:bottom w:type="dxa" w:w="75"/>
+              <w:right w:type="dxa" w:w="120"/>
+            </w:tcMar>
+            <w:vAlign w:val="center"/>
+          </w:tcPr>
+          <w:p>
+            <w:pPr>
+              <w:spacing w:after="0" w:line="255"/>
             </w:pPr>
             <w:r>
               <w:rPr>
                 <w:b/>
                 <w:bCs/>
-                <w:sz w:val="16"/>
-                <w:szCs w:val="16"/>
+                <w:sz w:val="17"/>
+                <w:szCs w:val="17"/>
               </w:rPr>
               <w:t xml:space="preserve">Formatos de hoja</w:t>
             </w:r>
@@ -1481,28 +1744,29 @@
           <w:tcPr>
             <w:tcW w:type="dxa" w:w="3740"/>
             <w:tcMar>
-              <w:top w:type="dxa" w:w="45"/>
-              <w:left w:type="dxa" w:w="80"/>
-              <w:bottom w:type="dxa" w:w="45"/>
-              <w:right w:type="dxa" w:w="80"/>
-            </w:tcMar>
-          </w:tcPr>
-          <w:p>
-            <w:pPr>
-              <w:spacing w:after="0" w:line="240"/>
-            </w:pPr>
-            <w:r>
-              <w:rPr>
-                <w:sz w:val="16"/>
-                <w:szCs w:val="16"/>
+              <w:top w:type="dxa" w:w="75"/>
+              <w:left w:type="dxa" w:w="120"/>
+              <w:bottom w:type="dxa" w:w="75"/>
+              <w:right w:type="dxa" w:w="120"/>
+            </w:tcMar>
+            <w:vAlign w:val="center"/>
+          </w:tcPr>
+          <w:p>
+            <w:pPr>
+              <w:spacing w:after="0" w:line="255"/>
+            </w:pPr>
+            <w:r>
+              <w:rPr>
+                <w:sz w:val="17"/>
+                <w:szCs w:val="17"/>
               </w:rPr>
               <w:t xml:space="preserve">Serie A: A0 841 × 1189 mm; A4 210 × 297 mm. </w:t>
             </w:r>
             <w:r>
               <w:rPr>
                 <w:color w:val="5B6575"/>
-                <w:sz w:val="13"/>
-                <w:szCs w:val="13"/>
+                <w:sz w:val="14"/>
+                <w:szCs w:val="14"/>
               </w:rPr>
               <w:t xml:space="preserve">[6]</w:t>
             </w:r>
@@ -1512,28 +1776,29 @@
           <w:tcPr>
             <w:tcW w:type="dxa" w:w="3740"/>
             <w:tcMar>
-              <w:top w:type="dxa" w:w="45"/>
-              <w:left w:type="dxa" w:w="80"/>
-              <w:bottom w:type="dxa" w:w="45"/>
-              <w:right w:type="dxa" w:w="80"/>
-            </w:tcMar>
-          </w:tcPr>
-          <w:p>
-            <w:pPr>
-              <w:spacing w:after="0" w:line="240"/>
-            </w:pPr>
-            <w:r>
-              <w:rPr>
-                <w:sz w:val="16"/>
-                <w:szCs w:val="16"/>
+              <w:top w:type="dxa" w:w="75"/>
+              <w:left w:type="dxa" w:w="120"/>
+              <w:bottom w:type="dxa" w:w="75"/>
+              <w:right w:type="dxa" w:w="120"/>
+            </w:tcMar>
+            <w:vAlign w:val="center"/>
+          </w:tcPr>
+          <w:p>
+            <w:pPr>
+              <w:spacing w:after="0" w:line="255"/>
+            </w:pPr>
+            <w:r>
+              <w:rPr>
+                <w:sz w:val="17"/>
+                <w:szCs w:val="17"/>
               </w:rPr>
               <w:t xml:space="preserve">Serie en pulgadas: A 8.5 × 11 in hasta E 34 × 44 in. El tamaño ANSI B no equivale al ISO B. </w:t>
             </w:r>
             <w:r>
               <w:rPr>
                 <w:color w:val="5B6575"/>
-                <w:sz w:val="13"/>
-                <w:szCs w:val="13"/>
+                <w:sz w:val="14"/>
+                <w:szCs w:val="14"/>
               </w:rPr>
               <w:t xml:space="preserve">[13]</w:t>
             </w:r>
@@ -1541,11 +1806,6 @@
         </w:tc>
       </w:tr>
     </w:tbl>
-    <w:p>
-      <w:pPr>
-        <w:spacing w:after="60"/>
-      </w:pPr>
-    </w:p>
     <w:p>
       <w:pPr>
         <w:pStyle w:val="Heading2"/>
@@ -1561,7 +1821,7 @@
           <w:ilvl w:val="0"/>
           <w:numId w:val="2"/>
         </w:numPr>
-        <w:spacing w:after="50" w:line="264"/>
+        <w:spacing w:after="90" w:line="276"/>
       </w:pPr>
       <w:r>
         <w:rPr>
@@ -1595,7 +1855,7 @@
           <w:ilvl w:val="0"/>
           <w:numId w:val="2"/>
         </w:numPr>
-        <w:spacing w:after="50" w:line="264"/>
+        <w:spacing w:after="90" w:line="276"/>
       </w:pPr>
       <w:r>
         <w:rPr>
@@ -1644,7 +1904,7 @@
           <w:ilvl w:val="0"/>
           <w:numId w:val="2"/>
         </w:numPr>
-        <w:spacing w:after="50" w:line="264"/>
+        <w:spacing w:after="90" w:line="276"/>
       </w:pPr>
       <w:r>
         <w:rPr>
@@ -1670,7 +1930,7 @@
           <w:ilvl w:val="0"/>
           <w:numId w:val="2"/>
         </w:numPr>
-        <w:spacing w:after="50" w:line="264"/>
+        <w:spacing w:after="90" w:line="276"/>
       </w:pPr>
       <w:r>
         <w:rPr>
@@ -1704,7 +1964,7 @@
           <w:ilvl w:val="0"/>
           <w:numId w:val="2"/>
         </w:numPr>
-        <w:spacing w:after="50" w:line="264"/>
+        <w:spacing w:after="90" w:line="276"/>
       </w:pPr>
       <w:r>
         <w:rPr>
@@ -1741,7 +2001,7 @@
     </w:p>
     <w:p>
       <w:pPr>
-        <w:spacing w:after="80" w:line="264"/>
+        <w:spacing w:after="100" w:line="264"/>
         <w:jc w:val="both"/>
       </w:pPr>
       <w:r>
@@ -1762,8 +2022,19 @@
     </w:p>
     <w:p>
       <w:pPr>
+        <w:sectPr>
+          <w:footerReference w:type="default" r:id="rId7"/>
+          <w:pgSz w:w="12240" w:h="15840" w:orient="portrait"/>
+          <w:pgMar w:top="880" w:right="1080" w:bottom="860" w:left="1080" w:header="420" w:footer="420" w:gutter="0"/>
+          <w:pgNumType w:start="1"/>
+          <w:docGrid w:linePitch="360"/>
+        </w:sectPr>
+      </w:pPr>
+    </w:p>
+    <w:p>
+      <w:pPr>
         <w:spacing w:after="30" w:line="240"/>
-        <w:ind w:left="300" w:hanging="300"/>
+        <w:ind w:left="280" w:hanging="280"/>
       </w:pPr>
       <w:r>
         <w:rPr>
@@ -1779,13 +2050,13 @@
           <w:sz w:val="15"/>
           <w:szCs w:val="15"/>
         </w:rPr>
-        <w:t xml:space="preserve"> Secretaría de Economía, “NOM-008-SE-2021, Sistema general de unidades de medida,” Diario Oficial de la Federación, 2023. [En línea]. Disponible: https://www.dof.gob.mx/nota_detalle.php?codigo=5713228&amp;fecha=29%2F12%2F2023</w:t>
+        <w:t xml:space="preserve"> Secretaría de Economía, “NOM-008-SE-2021, Sistema general de unidades de medida,” Diario Oficial de la Federación, 2023. Disponible: https://www.dof.gob.mx/nota_detalle.php?codigo=5713228&amp;fecha=29%2F12%2F2023</w:t>
       </w:r>
     </w:p>
     <w:p>
       <w:pPr>
         <w:spacing w:after="30" w:line="240"/>
-        <w:ind w:left="300" w:hanging="300"/>
+        <w:ind w:left="280" w:hanging="280"/>
       </w:pPr>
       <w:r>
         <w:rPr>
@@ -1801,13 +2072,13 @@
           <w:sz w:val="15"/>
           <w:szCs w:val="15"/>
         </w:rPr>
-        <w:t xml:space="preserve"> IMNC, “NMX-DT-128-30-IMNC-2010. Dibujo técnico. Principios generales de presentación. Parte 30,” 2010. [En línea]. Disponible: https://platiica.economia.gob.mx/normalizacion/nmx-dt-128-30-imnc-2010/</w:t>
+        <w:t xml:space="preserve"> IMNC, “NMX-DT-128-30-IMNC-2010. Dibujo técnico. Principios generales de presentación. Parte 30,” 2010. Disponible: https://platiica.economia.gob.mx/normalizacion/nmx-dt-128-30-imnc-2010/</w:t>
       </w:r>
     </w:p>
     <w:p>
       <w:pPr>
         <w:spacing w:after="30" w:line="240"/>
-        <w:ind w:left="300" w:hanging="300"/>
+        <w:ind w:left="280" w:hanging="280"/>
       </w:pPr>
       <w:r>
         <w:rPr>
@@ -1823,13 +2094,13 @@
           <w:sz w:val="15"/>
           <w:szCs w:val="15"/>
         </w:rPr>
-        <w:t xml:space="preserve"> ISO, “ISO 128-1:2020. Technical product documentation (TPD). General principles of representation. Part 1,” 2020. [En línea]. Disponible: https://www.iso.org/standard/65296.html</w:t>
+        <w:t xml:space="preserve"> ISO, “ISO 128-1:2020. Technical product documentation (TPD). General principles of representation. Part 1,” 2020. Disponible: https://www.iso.org/standard/65296.html</w:t>
       </w:r>
     </w:p>
     <w:p>
       <w:pPr>
         <w:spacing w:after="30" w:line="240"/>
-        <w:ind w:left="300" w:hanging="300"/>
+        <w:ind w:left="280" w:hanging="280"/>
       </w:pPr>
       <w:r>
         <w:rPr>
@@ -1845,13 +2116,13 @@
           <w:sz w:val="15"/>
           <w:szCs w:val="15"/>
         </w:rPr>
-        <w:t xml:space="preserve"> ISO, “ISO 129-1:2018. Technical product documentation (TPD). Presentation of dimensions and tolerances. Part 1,” 2018. [En línea]. Disponible: https://www.iso.org/standard/64007.html</w:t>
+        <w:t xml:space="preserve"> ISO, “ISO 129-1:2018. Technical product documentation (TPD). Presentation of dimensions and tolerances. Part 1,” 2018. Disponible: https://www.iso.org/standard/64007.html</w:t>
       </w:r>
     </w:p>
     <w:p>
       <w:pPr>
         <w:spacing w:after="30" w:line="240"/>
-        <w:ind w:left="300" w:hanging="300"/>
+        <w:ind w:left="280" w:hanging="280"/>
       </w:pPr>
       <w:r>
         <w:rPr>
@@ -1873,7 +2144,7 @@
     <w:p>
       <w:pPr>
         <w:spacing w:after="30" w:line="240"/>
-        <w:ind w:left="300" w:hanging="300"/>
+        <w:ind w:left="280" w:hanging="280"/>
       </w:pPr>
       <w:r>
         <w:rPr>
@@ -1889,13 +2160,13 @@
           <w:sz w:val="15"/>
           <w:szCs w:val="15"/>
         </w:rPr>
-        <w:t xml:space="preserve"> ISO, “ISO 216:2007. Writing paper and certain classes of printed matter. Trimmed sizes. A and B series,” 2007. [En línea]. Disponible: https://www.iso.org/standard/36631.html</w:t>
+        <w:t xml:space="preserve"> ISO, “ISO 216:2007. Writing paper and certain classes of printed matter. Trimmed sizes. A and B series,” 2007. Disponible: https://www.iso.org/standard/36631.html</w:t>
       </w:r>
     </w:p>
     <w:p>
       <w:pPr>
         <w:spacing w:after="30" w:line="240"/>
-        <w:ind w:left="300" w:hanging="300"/>
+        <w:ind w:left="280" w:hanging="280"/>
       </w:pPr>
       <w:r>
         <w:rPr>
@@ -1911,13 +2182,13 @@
           <w:sz w:val="15"/>
           <w:szCs w:val="15"/>
         </w:rPr>
-        <w:t xml:space="preserve"> ANSI, “History.” [En línea]. Disponible: https://www.ansi.org/about/history</w:t>
+        <w:t xml:space="preserve"> ANSI, “History.” Disponible: https://www.ansi.org/about/history</w:t>
       </w:r>
     </w:p>
     <w:p>
       <w:pPr>
         <w:spacing w:after="30" w:line="240"/>
-        <w:ind w:left="300" w:hanging="300"/>
+        <w:ind w:left="280" w:hanging="280"/>
       </w:pPr>
       <w:r>
         <w:rPr>
@@ -1933,13 +2204,13 @@
           <w:sz w:val="15"/>
           <w:szCs w:val="15"/>
         </w:rPr>
-        <w:t xml:space="preserve"> ASME, “Y14.5-2018. Dimensioning and Tolerancing.” [En línea]. Disponible: https://www.asme.org/codes-standards/find-codes-standards/y14-5-dimensioning-tolerancing/2018</w:t>
+        <w:t xml:space="preserve"> ASME, “Y14.5-2018. Dimensioning and Tolerancing.” Disponible: https://www.asme.org/codes-standards/find-codes-standards/y14-5-dimensioning-tolerancing/2018</w:t>
       </w:r>
     </w:p>
     <w:p>
       <w:pPr>
         <w:spacing w:after="30" w:line="240"/>
-        <w:ind w:left="300" w:hanging="300"/>
+        <w:ind w:left="280" w:hanging="280"/>
       </w:pPr>
       <w:r>
         <w:rPr>
@@ -1955,13 +2226,13 @@
           <w:sz w:val="15"/>
           <w:szCs w:val="15"/>
         </w:rPr>
-        <w:t xml:space="preserve"> ASME, “Y14.3. Orthographic and Pictorial Views.” [En línea]. Disponible: https://www.asme.org/codes-standards/find-codes-standards/y14-3-orthographic-pictorial-views</w:t>
+        <w:t xml:space="preserve"> ASME, “Y14.3. Orthographic and Pictorial Views.” Disponible: https://www.asme.org/codes-standards/find-codes-standards/y14-3-orthographic-pictorial-views</w:t>
       </w:r>
     </w:p>
     <w:p>
       <w:pPr>
         <w:spacing w:after="30" w:line="240"/>
-        <w:ind w:left="300" w:hanging="300"/>
+        <w:ind w:left="280" w:hanging="280"/>
       </w:pPr>
       <w:r>
         <w:rPr>
@@ -1977,13 +2248,13 @@
           <w:sz w:val="15"/>
           <w:szCs w:val="15"/>
         </w:rPr>
-        <w:t xml:space="preserve"> Autodesk, “Métodos de proyección,” Autodesk Help. [En línea]. Disponible: https://help.autodesk.com/cloudhelp/ENU/FDOC-Core/files/GUID-0DB05CD9-BE99-4E45-9FBD-8B8AF1F297BF.htm</w:t>
+        <w:t xml:space="preserve"> Autodesk, “Métodos de proyección,” Autodesk Help. Disponible: https://help.autodesk.com/cloudhelp/ENU/FDOC-Core/files/GUID-0DB05CD9-BE99-4E45-9FBD-8B8AF1F297BF.htm</w:t>
       </w:r>
     </w:p>
     <w:p>
       <w:pPr>
         <w:spacing w:after="30" w:line="240"/>
-        <w:ind w:left="300" w:hanging="300"/>
+        <w:ind w:left="280" w:hanging="280"/>
       </w:pPr>
       <w:r>
         <w:rPr>
@@ -1999,13 +2270,13 @@
           <w:sz w:val="15"/>
           <w:szCs w:val="15"/>
         </w:rPr>
-        <w:t xml:space="preserve"> ISO, “ISO 128-3:2022.” Ficha de catálogo. [En línea]. Disponible: https://iteh.es/catalog/standards/iso/75d888a5-6e9a-4fac-9120-8f2dffc20899/iso-128-3-2022</w:t>
+        <w:t xml:space="preserve"> ISO, “ISO 128-3:2022.” Ficha de catálogo. Disponible: https://iteh.es/catalog/standards/iso/75d888a5-6e9a-4fac-9120-8f2dffc20899/iso-128-3-2022</w:t>
       </w:r>
     </w:p>
     <w:p>
       <w:pPr>
         <w:spacing w:after="30" w:line="240"/>
-        <w:ind w:left="300" w:hanging="300"/>
+        <w:ind w:left="280" w:hanging="280"/>
       </w:pPr>
       <w:r>
         <w:rPr>
@@ -2021,13 +2292,13 @@
           <w:sz w:val="15"/>
           <w:szCs w:val="15"/>
         </w:rPr>
-        <w:t xml:space="preserve"> ISO, “ISO 8015:2011. Geometrical product specifications (GPS). Fundamentals. Concepts, principles and rules,” 2011. [En línea]. Disponible: https://www.iso.org/standard/55979.html</w:t>
+        <w:t xml:space="preserve"> ISO, “ISO 8015:2011. Geometrical product specifications (GPS). Fundamentals. Concepts, principles and rules,” 2011. Disponible: https://www.iso.org/standard/55979.html</w:t>
       </w:r>
     </w:p>
     <w:p>
       <w:pPr>
         <w:spacing w:after="30" w:line="240"/>
-        <w:ind w:left="300" w:hanging="300"/>
+        <w:ind w:left="280" w:hanging="280"/>
       </w:pPr>
       <w:r>
         <w:rPr>
@@ -2043,13 +2314,13 @@
           <w:sz w:val="15"/>
           <w:szCs w:val="15"/>
         </w:rPr>
-        <w:t xml:space="preserve"> ANSI, “Standard paper sizes: ISO &amp; ANSI A/A4,” blog de ANSI. [En línea]. Disponible: https://blog.ansi.org/ansi/standard-paper-sizes-iso-ansi-a-a4/</w:t>
+        <w:t xml:space="preserve"> ANSI, “Standard paper sizes: ISO &amp; ANSI A/A4,” blog de ANSI. Disponible: https://blog.ansi.org/ansi/standard-paper-sizes-iso-ansi-a-a4/</w:t>
       </w:r>
     </w:p>
     <w:p>
       <w:pPr>
         <w:spacing w:after="30" w:line="240"/>
-        <w:ind w:left="300" w:hanging="300"/>
+        <w:ind w:left="280" w:hanging="280"/>
       </w:pPr>
       <w:r>
         <w:rPr>
@@ -2065,13 +2336,13 @@
           <w:sz w:val="15"/>
           <w:szCs w:val="15"/>
         </w:rPr>
-        <w:t xml:space="preserve"> ISO, “ISO 286-1:2010. Geometrical product specifications (GPS). ISO code system for tolerances on linear sizes. Part 1,” 2010. [En línea]. Disponible: https://www.iso.org/standard/45975.html</w:t>
+        <w:t xml:space="preserve"> ISO, “ISO 286-1:2010. Geometrical product specifications (GPS). ISO code system for tolerances on linear sizes. Part 1,” 2010. Disponible: https://www.iso.org/standard/45975.html</w:t>
       </w:r>
     </w:p>
     <w:p>
       <w:pPr>
         <w:spacing w:after="30" w:line="240"/>
-        <w:ind w:left="300" w:hanging="300"/>
+        <w:ind w:left="280" w:hanging="280"/>
       </w:pPr>
       <w:r>
         <w:rPr>
@@ -2087,13 +2358,13 @@
           <w:sz w:val="15"/>
           <w:szCs w:val="15"/>
         </w:rPr>
-        <w:t xml:space="preserve"> ASME, “Workforce blog: engineering education falls short on GD&amp;T.” [En línea]. Disponible: https://www.asme.org/topics-resources/content/workforce-blog-engineering-education-falls-short-on-gd-t</w:t>
+        <w:t xml:space="preserve"> ASME, “Workforce blog: engineering education falls short on GD&amp;T.” Disponible: https://www.asme.org/topics-resources/content/workforce-blog-engineering-education-falls-short-on-gd-t</w:t>
       </w:r>
     </w:p>
     <w:p>
       <w:pPr>
         <w:spacing w:after="30" w:line="240"/>
-        <w:ind w:left="300" w:hanging="300"/>
+        <w:ind w:left="280" w:hanging="280"/>
       </w:pPr>
       <w:r>
         <w:rPr>
@@ -2109,14 +2380,15 @@
           <w:sz w:val="15"/>
           <w:szCs w:val="15"/>
         </w:rPr>
-        <w:t xml:space="preserve"> ASEE, “Modifying CAD courses to improve proficiency in interpretation of engineering drawings.” [En línea]. Disponible: https://peer.asee.org/modifying-cad-courses-to-improve-proficiency-in-interpretation-of-engineering-drawings-using-modified-constructivism-approach.pdf</w:t>
+        <w:t xml:space="preserve"> ASEE, “Modifying CAD courses to improve proficiency in interpretation of engineering drawings.” Disponible: https://peer.asee.org/modifying-cad-courses-to-improve-proficiency-in-interpretation-of-engineering-drawings-using-modified-constructivism-approach.pdf</w:t>
       </w:r>
     </w:p>
     <w:sectPr>
-      <w:footerReference w:type="default" r:id="rId7"/>
+      <w:type w:val="continuous"/>
       <w:pgSz w:w="12240" w:h="15840" w:orient="portrait"/>
-      <w:pgMar w:top="1000" w:right="1080" w:bottom="1000" w:left="1080" w:header="500" w:footer="500" w:gutter="0"/>
-      <w:pgNumType w:start="1"/>
+      <w:pgMar w:top="880" w:right="1080" w:bottom="860" w:left="1080" w:header="420" w:footer="420" w:gutter="0"/>
+      <w:pgNumType/>
+      <w:cols w:space="560" w:num="2"/>
       <w:docGrid w:linePitch="360"/>
     </w:sectPr>
   </w:body>
@@ -2528,9 +2800,9 @@
     <w:pPr>
       <w:keepNext/>
       <w:pBdr>
-        <w:bottom w:val="single" w:color="C9D3DF" w:sz="6" w:space="2"/>
+        <w:bottom w:val="single" w:color="C9D3DF" w:sz="6" w:space="3"/>
       </w:pBdr>
-      <w:spacing w:after="80" w:before="200"/>
+      <w:spacing w:after="110" w:before="260"/>
       <w:outlineLvl w:val="1"/>
     </w:pPr>
     <w:rPr>
@@ -2538,8 +2810,8 @@
       <w:b/>
       <w:bCs/>
       <w:color w:val="1F4E79"/>
-      <w:sz w:val="22"/>
-      <w:szCs w:val="22"/>
+      <w:sz w:val="23"/>
+      <w:szCs w:val="23"/>
     </w:rPr>
   </w:style>
 </w:styles>

</xml_diff>